<commit_message>
Update report for assignment
</commit_message>
<xml_diff>
--- a/LinuxProgrammingAssignment/Project/LinuxProgrammingAssignmentReport.docx
+++ b/LinuxProgrammingAssignment/Project/LinuxProgrammingAssignmentReport.docx
@@ -1312,12 +1312,16 @@
                               <w:jc w:val="center"/>
                               <w:rPr>
                                 <w:rFonts w:ascii="Segoe UI" w:hAnsi="Segoe UI" w:cs="Segoe UI"/>
+                                <w:b/>
+                                <w:bCs/>
                               </w:rPr>
                             </w:pPr>
                             <w:proofErr w:type="spellStart"/>
                             <w:r>
                               <w:rPr>
                                 <w:rFonts w:ascii="Segoe UI" w:hAnsi="Segoe UI" w:cs="Segoe UI"/>
+                                <w:b/>
+                                <w:bCs/>
                               </w:rPr>
                               <w:t>g_period_ns</w:t>
                             </w:r>
@@ -1354,12 +1358,16 @@
                         <w:jc w:val="center"/>
                         <w:rPr>
                           <w:rFonts w:ascii="Segoe UI" w:hAnsi="Segoe UI" w:cs="Segoe UI"/>
+                          <w:b/>
+                          <w:bCs/>
                         </w:rPr>
                       </w:pPr>
                       <w:proofErr w:type="spellStart"/>
                       <w:r>
                         <w:rPr>
                           <w:rFonts w:ascii="Segoe UI" w:hAnsi="Segoe UI" w:cs="Segoe UI"/>
+                          <w:b/>
+                          <w:bCs/>
                         </w:rPr>
                         <w:t>g_period_ns</w:t>
                       </w:r>
@@ -1636,15 +1644,15 @@
         <mc:AlternateContent>
           <mc:Choice Requires="wps">
             <w:drawing>
-              <wp:anchor distT="0" distB="0" distL="114300" distR="114300" simplePos="0" relativeHeight="251675136" behindDoc="0" locked="0" layoutInCell="1" allowOverlap="1" wp14:anchorId="28C7C287" wp14:editId="4E8083AA">
+              <wp:anchor distT="0" distB="0" distL="114300" distR="114300" simplePos="0" relativeHeight="251675136" behindDoc="0" locked="0" layoutInCell="1" allowOverlap="1" wp14:anchorId="28C7C287" wp14:editId="72B18C0E">
                 <wp:simplePos x="0" y="0"/>
                 <wp:positionH relativeFrom="column">
                   <wp:posOffset>4869180</wp:posOffset>
                 </wp:positionH>
                 <wp:positionV relativeFrom="paragraph">
-                  <wp:posOffset>60960</wp:posOffset>
+                  <wp:posOffset>63500</wp:posOffset>
                 </wp:positionV>
-                <wp:extent cx="1127760" cy="883920"/>
+                <wp:extent cx="1379220" cy="883920"/>
                 <wp:effectExtent l="0" t="0" r="0" b="0"/>
                 <wp:wrapNone/>
                 <wp:docPr id="882176011" name="Text Box 5"/>
@@ -1656,7 +1664,7 @@
                       <wps:spPr>
                         <a:xfrm>
                           <a:off x="0" y="0"/>
-                          <a:ext cx="1127760" cy="883920"/>
+                          <a:ext cx="1379220" cy="883920"/>
                         </a:xfrm>
                         <a:prstGeom prst="rect">
                           <a:avLst/>
@@ -1673,12 +1681,16 @@
                               <w:spacing w:line="240" w:lineRule="auto"/>
                               <w:rPr>
                                 <w:rFonts w:ascii="Segoe UI" w:hAnsi="Segoe UI" w:cs="Segoe UI"/>
+                                <w:b/>
+                                <w:bCs/>
                               </w:rPr>
                             </w:pPr>
                             <w:proofErr w:type="spellStart"/>
                             <w:r>
                               <w:rPr>
                                 <w:rFonts w:ascii="Segoe UI" w:hAnsi="Segoe UI" w:cs="Segoe UI"/>
+                                <w:b/>
+                                <w:bCs/>
                               </w:rPr>
                               <w:t>g_T</w:t>
                             </w:r>
@@ -1689,12 +1701,16 @@
                               <w:spacing w:line="240" w:lineRule="auto"/>
                               <w:rPr>
                                 <w:rFonts w:ascii="Segoe UI" w:hAnsi="Segoe UI" w:cs="Segoe UI"/>
+                                <w:b/>
+                                <w:bCs/>
                               </w:rPr>
                             </w:pPr>
                             <w:proofErr w:type="spellStart"/>
                             <w:r>
                               <w:rPr>
                                 <w:rFonts w:ascii="Segoe UI" w:hAnsi="Segoe UI" w:cs="Segoe UI"/>
+                                <w:b/>
+                                <w:bCs/>
                               </w:rPr>
                               <w:t>g_new_sample</w:t>
                             </w:r>
@@ -1705,12 +1721,16 @@
                               <w:spacing w:line="240" w:lineRule="auto"/>
                               <w:rPr>
                                 <w:rFonts w:ascii="Segoe UI" w:hAnsi="Segoe UI" w:cs="Segoe UI"/>
+                                <w:b/>
+                                <w:bCs/>
                               </w:rPr>
                             </w:pPr>
                             <w:proofErr w:type="spellStart"/>
                             <w:r>
                               <w:rPr>
                                 <w:rFonts w:ascii="Segoe UI" w:hAnsi="Segoe UI" w:cs="Segoe UI"/>
+                                <w:b/>
+                                <w:bCs/>
                               </w:rPr>
                               <w:t>cond</w:t>
                             </w:r>
@@ -1718,8 +1738,18 @@
                             <w:r>
                               <w:rPr>
                                 <w:rFonts w:ascii="Segoe UI" w:hAnsi="Segoe UI" w:cs="Segoe UI"/>
+                                <w:b/>
+                                <w:bCs/>
                               </w:rPr>
                               <w:t xml:space="preserve"> signal</w:t>
+                            </w:r>
+                            <w:r>
+                              <w:rPr>
+                                <w:rFonts w:ascii="Segoe UI" w:hAnsi="Segoe UI" w:cs="Segoe UI"/>
+                                <w:b/>
+                                <w:bCs/>
+                              </w:rPr>
+                              <w:t>ing</w:t>
                             </w:r>
                           </w:p>
                           <w:p>
@@ -1727,6 +1757,8 @@
                               <w:spacing w:line="240" w:lineRule="auto"/>
                               <w:rPr>
                                 <w:rFonts w:ascii="Segoe UI" w:hAnsi="Segoe UI" w:cs="Segoe UI"/>
+                                <w:b/>
+                                <w:bCs/>
                               </w:rPr>
                             </w:pPr>
                           </w:p>
@@ -1735,6 +1767,8 @@
                               <w:spacing w:line="240" w:lineRule="auto"/>
                               <w:rPr>
                                 <w:rFonts w:ascii="Segoe UI" w:hAnsi="Segoe UI" w:cs="Segoe UI"/>
+                                <w:b/>
+                                <w:bCs/>
                               </w:rPr>
                             </w:pPr>
                           </w:p>
@@ -1760,7 +1794,7 @@
           </mc:Choice>
           <mc:Fallback>
             <w:pict>
-              <v:shape w14:anchorId="28C7C287" id="_x0000_s1030" type="#_x0000_t202" style="position:absolute;margin-left:383.4pt;margin-top:4.8pt;width:88.8pt;height:69.6pt;z-index:251675136;visibility:visible;mso-wrap-style:square;mso-width-percent:0;mso-height-percent:0;mso-wrap-distance-left:9pt;mso-wrap-distance-top:0;mso-wrap-distance-right:9pt;mso-wrap-distance-bottom:0;mso-position-horizontal:absolute;mso-position-horizontal-relative:text;mso-position-vertical:absolute;mso-position-vertical-relative:text;mso-width-percent:0;mso-height-percent:0;mso-width-relative:margin;mso-height-relative:margin;v-text-anchor:middle" o:gfxdata="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" filled="f" stroked="f" strokeweight=".5pt">
+              <v:shape w14:anchorId="28C7C287" id="_x0000_s1030" type="#_x0000_t202" style="position:absolute;margin-left:383.4pt;margin-top:5pt;width:108.6pt;height:69.6pt;z-index:251675136;visibility:visible;mso-wrap-style:square;mso-width-percent:0;mso-height-percent:0;mso-wrap-distance-left:9pt;mso-wrap-distance-top:0;mso-wrap-distance-right:9pt;mso-wrap-distance-bottom:0;mso-position-horizontal:absolute;mso-position-horizontal-relative:text;mso-position-vertical:absolute;mso-position-vertical-relative:text;mso-width-percent:0;mso-height-percent:0;mso-width-relative:margin;mso-height-relative:margin;v-text-anchor:middle" o:gfxdata="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" filled="f" stroked="f" strokeweight=".5pt">
                 <v:textbox>
                   <w:txbxContent>
                     <w:p>
@@ -1768,12 +1802,16 @@
                         <w:spacing w:line="240" w:lineRule="auto"/>
                         <w:rPr>
                           <w:rFonts w:ascii="Segoe UI" w:hAnsi="Segoe UI" w:cs="Segoe UI"/>
+                          <w:b/>
+                          <w:bCs/>
                         </w:rPr>
                       </w:pPr>
                       <w:proofErr w:type="spellStart"/>
                       <w:r>
                         <w:rPr>
                           <w:rFonts w:ascii="Segoe UI" w:hAnsi="Segoe UI" w:cs="Segoe UI"/>
+                          <w:b/>
+                          <w:bCs/>
                         </w:rPr>
                         <w:t>g_T</w:t>
                       </w:r>
@@ -1784,12 +1822,16 @@
                         <w:spacing w:line="240" w:lineRule="auto"/>
                         <w:rPr>
                           <w:rFonts w:ascii="Segoe UI" w:hAnsi="Segoe UI" w:cs="Segoe UI"/>
+                          <w:b/>
+                          <w:bCs/>
                         </w:rPr>
                       </w:pPr>
                       <w:proofErr w:type="spellStart"/>
                       <w:r>
                         <w:rPr>
                           <w:rFonts w:ascii="Segoe UI" w:hAnsi="Segoe UI" w:cs="Segoe UI"/>
+                          <w:b/>
+                          <w:bCs/>
                         </w:rPr>
                         <w:t>g_new_sample</w:t>
                       </w:r>
@@ -1800,12 +1842,16 @@
                         <w:spacing w:line="240" w:lineRule="auto"/>
                         <w:rPr>
                           <w:rFonts w:ascii="Segoe UI" w:hAnsi="Segoe UI" w:cs="Segoe UI"/>
+                          <w:b/>
+                          <w:bCs/>
                         </w:rPr>
                       </w:pPr>
                       <w:proofErr w:type="spellStart"/>
                       <w:r>
                         <w:rPr>
                           <w:rFonts w:ascii="Segoe UI" w:hAnsi="Segoe UI" w:cs="Segoe UI"/>
+                          <w:b/>
+                          <w:bCs/>
                         </w:rPr>
                         <w:t>cond</w:t>
                       </w:r>
@@ -1813,8 +1859,18 @@
                       <w:r>
                         <w:rPr>
                           <w:rFonts w:ascii="Segoe UI" w:hAnsi="Segoe UI" w:cs="Segoe UI"/>
+                          <w:b/>
+                          <w:bCs/>
                         </w:rPr>
                         <w:t xml:space="preserve"> signal</w:t>
+                      </w:r>
+                      <w:r>
+                        <w:rPr>
+                          <w:rFonts w:ascii="Segoe UI" w:hAnsi="Segoe UI" w:cs="Segoe UI"/>
+                          <w:b/>
+                          <w:bCs/>
+                        </w:rPr>
+                        <w:t>ing</w:t>
                       </w:r>
                     </w:p>
                     <w:p>
@@ -1822,6 +1878,8 @@
                         <w:spacing w:line="240" w:lineRule="auto"/>
                         <w:rPr>
                           <w:rFonts w:ascii="Segoe UI" w:hAnsi="Segoe UI" w:cs="Segoe UI"/>
+                          <w:b/>
+                          <w:bCs/>
                         </w:rPr>
                       </w:pPr>
                     </w:p>
@@ -1830,6 +1888,8 @@
                         <w:spacing w:line="240" w:lineRule="auto"/>
                         <w:rPr>
                           <w:rFonts w:ascii="Segoe UI" w:hAnsi="Segoe UI" w:cs="Segoe UI"/>
+                          <w:b/>
+                          <w:bCs/>
                         </w:rPr>
                       </w:pPr>
                     </w:p>
@@ -2752,298 +2812,90 @@
         <w:rPr>
           <w:rFonts w:ascii="Segoe UI" w:hAnsi="Segoe UI" w:cs="Segoe UI"/>
         </w:rPr>
-        <w:t>Advantages</w:t>
-      </w:r>
-      <w:r>
-        <w:rPr>
-          <w:rFonts w:ascii="Segoe UI" w:hAnsi="Segoe UI" w:cs="Segoe UI"/>
-        </w:rPr>
-        <w:t>:</w:t>
+        <w:t>Advantages:</w:t>
       </w:r>
     </w:p>
-    <w:tbl>
-      <w:tblPr>
-        <w:tblW w:w="0" w:type="auto"/>
-        <w:jc w:val="center"/>
-        <w:tblCellSpacing w:w="15" w:type="dxa"/>
-        <w:tblBorders>
-          <w:top w:val="single" w:sz="4" w:space="0" w:color="auto"/>
-          <w:left w:val="single" w:sz="4" w:space="0" w:color="auto"/>
-          <w:bottom w:val="single" w:sz="4" w:space="0" w:color="auto"/>
-          <w:right w:val="single" w:sz="4" w:space="0" w:color="auto"/>
-          <w:insideH w:val="single" w:sz="4" w:space="0" w:color="auto"/>
-          <w:insideV w:val="single" w:sz="4" w:space="0" w:color="auto"/>
-        </w:tblBorders>
-        <w:tblCellMar>
-          <w:top w:w="15" w:type="dxa"/>
-          <w:left w:w="15" w:type="dxa"/>
-          <w:bottom w:w="15" w:type="dxa"/>
-          <w:right w:w="15" w:type="dxa"/>
-        </w:tblCellMar>
-        <w:tblLook w:val="04A0" w:firstRow="1" w:lastRow="0" w:firstColumn="1" w:lastColumn="0" w:noHBand="0" w:noVBand="1"/>
-      </w:tblPr>
-      <w:tblGrid>
-        <w:gridCol w:w="2558"/>
-        <w:gridCol w:w="2543"/>
-      </w:tblGrid>
-      <w:tr>
-        <w:trPr>
-          <w:tblCellSpacing w:w="15" w:type="dxa"/>
-          <w:jc w:val="center"/>
-        </w:trPr>
-        <w:tc>
-          <w:tcPr>
-            <w:tcW w:w="0" w:type="auto"/>
-            <w:vAlign w:val="center"/>
-            <w:hideMark/>
-          </w:tcPr>
-          <w:p>
-            <w:pPr>
-              <w:spacing w:line="240" w:lineRule="auto"/>
-              <w:jc w:val="center"/>
-              <w:rPr>
-                <w:rFonts w:ascii="Segoe UI" w:hAnsi="Segoe UI" w:cs="Segoe UI"/>
-                <w:b/>
-                <w:bCs/>
-              </w:rPr>
-            </w:pPr>
-            <w:r>
-              <w:rPr>
-                <w:rFonts w:ascii="Segoe UI" w:hAnsi="Segoe UI" w:cs="Segoe UI"/>
-                <w:b/>
-                <w:bCs/>
-              </w:rPr>
-              <w:t>Technique</w:t>
-            </w:r>
-          </w:p>
-        </w:tc>
-        <w:tc>
-          <w:tcPr>
-            <w:tcW w:w="0" w:type="auto"/>
-            <w:vAlign w:val="center"/>
-            <w:hideMark/>
-          </w:tcPr>
-          <w:p>
-            <w:pPr>
-              <w:spacing w:line="240" w:lineRule="auto"/>
-              <w:jc w:val="center"/>
-              <w:rPr>
-                <w:rFonts w:ascii="Segoe UI" w:hAnsi="Segoe UI" w:cs="Segoe UI"/>
-                <w:b/>
-                <w:bCs/>
-              </w:rPr>
-            </w:pPr>
-            <w:r>
-              <w:rPr>
-                <w:rFonts w:ascii="Segoe UI" w:hAnsi="Segoe UI" w:cs="Segoe UI"/>
-                <w:b/>
-                <w:bCs/>
-              </w:rPr>
-              <w:t>Benefit</w:t>
-            </w:r>
-          </w:p>
-        </w:tc>
-      </w:tr>
-      <w:tr>
-        <w:trPr>
-          <w:tblCellSpacing w:w="15" w:type="dxa"/>
-          <w:jc w:val="center"/>
-        </w:trPr>
-        <w:tc>
-          <w:tcPr>
-            <w:tcW w:w="0" w:type="auto"/>
-            <w:vAlign w:val="center"/>
-            <w:hideMark/>
-          </w:tcPr>
-          <w:p>
-            <w:pPr>
-              <w:spacing w:line="240" w:lineRule="auto"/>
-              <w:rPr>
-                <w:rFonts w:ascii="Segoe UI" w:hAnsi="Segoe UI" w:cs="Segoe UI"/>
-              </w:rPr>
-            </w:pPr>
-            <w:r>
-              <w:rPr>
-                <w:rFonts w:ascii="Segoe UI" w:hAnsi="Segoe UI" w:cs="Segoe UI"/>
-              </w:rPr>
-              <w:t>TIMER_ABSTIME</w:t>
-            </w:r>
-          </w:p>
-        </w:tc>
-        <w:tc>
-          <w:tcPr>
-            <w:tcW w:w="0" w:type="auto"/>
-            <w:vAlign w:val="center"/>
-            <w:hideMark/>
-          </w:tcPr>
-          <w:p>
-            <w:pPr>
-              <w:spacing w:line="240" w:lineRule="auto"/>
-              <w:rPr>
-                <w:rFonts w:ascii="Segoe UI" w:hAnsi="Segoe UI" w:cs="Segoe UI"/>
-              </w:rPr>
-            </w:pPr>
-            <w:r>
-              <w:rPr>
-                <w:rFonts w:ascii="Segoe UI" w:hAnsi="Segoe UI" w:cs="Segoe UI"/>
-              </w:rPr>
-              <w:t>No drift accumulation</w:t>
-            </w:r>
-          </w:p>
-        </w:tc>
-      </w:tr>
-      <w:tr>
-        <w:trPr>
-          <w:tblCellSpacing w:w="15" w:type="dxa"/>
-          <w:jc w:val="center"/>
-        </w:trPr>
-        <w:tc>
-          <w:tcPr>
-            <w:tcW w:w="0" w:type="auto"/>
-            <w:vAlign w:val="center"/>
-            <w:hideMark/>
-          </w:tcPr>
-          <w:p>
-            <w:pPr>
-              <w:spacing w:line="240" w:lineRule="auto"/>
-              <w:rPr>
-                <w:rFonts w:ascii="Segoe UI" w:hAnsi="Segoe UI" w:cs="Segoe UI"/>
-              </w:rPr>
-            </w:pPr>
-            <w:r>
-              <w:rPr>
-                <w:rFonts w:ascii="Segoe UI" w:hAnsi="Segoe UI" w:cs="Segoe UI"/>
-              </w:rPr>
-              <w:t>Absolute time scheduling</w:t>
-            </w:r>
-          </w:p>
-        </w:tc>
-        <w:tc>
-          <w:tcPr>
-            <w:tcW w:w="0" w:type="auto"/>
-            <w:vAlign w:val="center"/>
-            <w:hideMark/>
-          </w:tcPr>
-          <w:p>
-            <w:pPr>
-              <w:spacing w:line="240" w:lineRule="auto"/>
-              <w:rPr>
-                <w:rFonts w:ascii="Segoe UI" w:hAnsi="Segoe UI" w:cs="Segoe UI"/>
-              </w:rPr>
-            </w:pPr>
-            <w:r>
-              <w:rPr>
-                <w:rFonts w:ascii="Segoe UI" w:hAnsi="Segoe UI" w:cs="Segoe UI"/>
-              </w:rPr>
-              <w:t>Stable periodic execution</w:t>
-            </w:r>
-          </w:p>
-        </w:tc>
-      </w:tr>
-      <w:tr>
-        <w:trPr>
-          <w:tblCellSpacing w:w="15" w:type="dxa"/>
-          <w:jc w:val="center"/>
-        </w:trPr>
-        <w:tc>
-          <w:tcPr>
-            <w:tcW w:w="0" w:type="auto"/>
-            <w:vAlign w:val="center"/>
-            <w:hideMark/>
-          </w:tcPr>
-          <w:p>
-            <w:pPr>
-              <w:spacing w:line="240" w:lineRule="auto"/>
-              <w:rPr>
-                <w:rFonts w:ascii="Segoe UI" w:hAnsi="Segoe UI" w:cs="Segoe UI"/>
-              </w:rPr>
-            </w:pPr>
-            <w:r>
-              <w:rPr>
-                <w:rFonts w:ascii="Segoe UI" w:hAnsi="Segoe UI" w:cs="Segoe UI"/>
-              </w:rPr>
-              <w:t>Short critical section</w:t>
-            </w:r>
-          </w:p>
-        </w:tc>
-        <w:tc>
-          <w:tcPr>
-            <w:tcW w:w="0" w:type="auto"/>
-            <w:vAlign w:val="center"/>
-            <w:hideMark/>
-          </w:tcPr>
-          <w:p>
-            <w:pPr>
-              <w:spacing w:line="240" w:lineRule="auto"/>
-              <w:rPr>
-                <w:rFonts w:ascii="Segoe UI" w:hAnsi="Segoe UI" w:cs="Segoe UI"/>
-              </w:rPr>
-            </w:pPr>
-            <w:r>
-              <w:rPr>
-                <w:rFonts w:ascii="Segoe UI" w:hAnsi="Segoe UI" w:cs="Segoe UI"/>
-              </w:rPr>
-              <w:t>Minimal blocking</w:t>
-            </w:r>
-          </w:p>
-        </w:tc>
-      </w:tr>
-      <w:tr>
-        <w:trPr>
-          <w:tblCellSpacing w:w="15" w:type="dxa"/>
-          <w:jc w:val="center"/>
-        </w:trPr>
-        <w:tc>
-          <w:tcPr>
-            <w:tcW w:w="0" w:type="auto"/>
-            <w:vAlign w:val="center"/>
-            <w:hideMark/>
-          </w:tcPr>
-          <w:p>
-            <w:pPr>
-              <w:spacing w:line="240" w:lineRule="auto"/>
-              <w:rPr>
-                <w:rFonts w:ascii="Segoe UI" w:hAnsi="Segoe UI" w:cs="Segoe UI"/>
-              </w:rPr>
-            </w:pPr>
-            <w:r>
-              <w:rPr>
-                <w:rFonts w:ascii="Segoe UI" w:hAnsi="Segoe UI" w:cs="Segoe UI"/>
-              </w:rPr>
-              <w:t>Signal-based wakeup</w:t>
-            </w:r>
-          </w:p>
-        </w:tc>
-        <w:tc>
-          <w:tcPr>
-            <w:tcW w:w="0" w:type="auto"/>
-            <w:vAlign w:val="center"/>
-            <w:hideMark/>
-          </w:tcPr>
-          <w:p>
-            <w:pPr>
-              <w:spacing w:line="240" w:lineRule="auto"/>
-              <w:rPr>
-                <w:rFonts w:ascii="Segoe UI" w:hAnsi="Segoe UI" w:cs="Segoe UI"/>
-              </w:rPr>
-            </w:pPr>
-            <w:r>
-              <w:rPr>
-                <w:rFonts w:ascii="Segoe UI" w:hAnsi="Segoe UI" w:cs="Segoe UI"/>
-              </w:rPr>
-              <w:t>No polling overhead</w:t>
-            </w:r>
-          </w:p>
-        </w:tc>
-      </w:tr>
-    </w:tbl>
     <w:p>
       <w:pPr>
+        <w:pStyle w:val="ListParagraph"/>
+        <w:numPr>
+          <w:ilvl w:val="1"/>
+          <w:numId w:val="27"/>
+        </w:numPr>
         <w:spacing w:line="240" w:lineRule="auto"/>
         <w:rPr>
           <w:rFonts w:ascii="Segoe UI" w:hAnsi="Segoe UI" w:cs="Segoe UI"/>
         </w:rPr>
       </w:pPr>
+      <w:r>
+        <w:rPr>
+          <w:rFonts w:ascii="Segoe UI" w:hAnsi="Segoe UI" w:cs="Segoe UI"/>
+        </w:rPr>
+        <w:t>TIMER_ABSTIME: no drift accumulation</w:t>
+      </w:r>
+    </w:p>
+    <w:p>
+      <w:pPr>
+        <w:pStyle w:val="ListParagraph"/>
+        <w:numPr>
+          <w:ilvl w:val="1"/>
+          <w:numId w:val="27"/>
+        </w:numPr>
+        <w:spacing w:line="240" w:lineRule="auto"/>
+        <w:rPr>
+          <w:rFonts w:ascii="Segoe UI" w:hAnsi="Segoe UI" w:cs="Segoe UI"/>
+        </w:rPr>
+      </w:pPr>
+      <w:r>
+        <w:rPr>
+          <w:rFonts w:ascii="Segoe UI" w:hAnsi="Segoe UI" w:cs="Segoe UI"/>
+        </w:rPr>
+        <w:t>Absolute time scheduling</w:t>
+      </w:r>
+      <w:r>
+        <w:rPr>
+          <w:rFonts w:ascii="Segoe UI" w:hAnsi="Segoe UI" w:cs="Segoe UI"/>
+        </w:rPr>
+        <w:t>: stable periodic execution</w:t>
+      </w:r>
+    </w:p>
+    <w:p>
+      <w:pPr>
+        <w:pStyle w:val="ListParagraph"/>
+        <w:numPr>
+          <w:ilvl w:val="1"/>
+          <w:numId w:val="27"/>
+        </w:numPr>
+        <w:spacing w:line="240" w:lineRule="auto"/>
+        <w:rPr>
+          <w:rFonts w:ascii="Segoe UI" w:hAnsi="Segoe UI" w:cs="Segoe UI"/>
+        </w:rPr>
+      </w:pPr>
+      <w:r>
+        <w:rPr>
+          <w:rFonts w:ascii="Segoe UI" w:hAnsi="Segoe UI" w:cs="Segoe UI"/>
+        </w:rPr>
+        <w:t>Short critical section: minimal blocking</w:t>
+      </w:r>
+    </w:p>
+    <w:p>
+      <w:pPr>
+        <w:pStyle w:val="ListParagraph"/>
+        <w:numPr>
+          <w:ilvl w:val="1"/>
+          <w:numId w:val="27"/>
+        </w:numPr>
+        <w:spacing w:line="240" w:lineRule="auto"/>
+        <w:rPr>
+          <w:rFonts w:ascii="Segoe UI" w:hAnsi="Segoe UI" w:cs="Segoe UI"/>
+        </w:rPr>
+      </w:pPr>
+      <w:r>
+        <w:rPr>
+          <w:rFonts w:ascii="Segoe UI" w:hAnsi="Segoe UI" w:cs="Segoe UI"/>
+        </w:rPr>
+        <w:t>Signal-based wakeup: no polling overhead</w:t>
+      </w:r>
     </w:p>
     <w:p>
       <w:pPr>
@@ -3219,7 +3071,19 @@
         <w:rPr>
           <w:rFonts w:ascii="Segoe UI" w:hAnsi="Segoe UI" w:cs="Segoe UI"/>
         </w:rPr>
-        <w:t xml:space="preserve">Read: </w:t>
+        <w:t>Read</w:t>
+      </w:r>
+      <w:r>
+        <w:rPr>
+          <w:rFonts w:ascii="Segoe UI" w:hAnsi="Segoe UI" w:cs="Segoe UI"/>
+        </w:rPr>
+        <w:t xml:space="preserve"> current time:</w:t>
+      </w:r>
+      <w:r>
+        <w:rPr>
+          <w:rFonts w:ascii="Segoe UI" w:hAnsi="Segoe UI" w:cs="Segoe UI"/>
+        </w:rPr>
+        <w:t xml:space="preserve"> </w:t>
       </w:r>
       <w:proofErr w:type="spellStart"/>
       <w:r>
@@ -3248,6 +3112,12 @@
         </w:rPr>
         <w:t xml:space="preserve">Compute: </w:t>
       </w:r>
+      <w:r>
+        <w:rPr>
+          <w:rFonts w:ascii="Segoe UI" w:hAnsi="Segoe UI" w:cs="Segoe UI"/>
+        </w:rPr>
+        <w:t>interval = current time – previous time</w:t>
+      </w:r>
     </w:p>
     <w:p>
       <w:pPr>
@@ -3306,7 +3176,19 @@
         <w:rPr>
           <w:rFonts w:ascii="Segoe UI" w:hAnsi="Segoe UI" w:cs="Segoe UI"/>
         </w:rPr>
-        <w:t>Write to log.txt</w:t>
+        <w:t>Write</w:t>
+      </w:r>
+      <w:r>
+        <w:rPr>
+          <w:rFonts w:ascii="Segoe UI" w:hAnsi="Segoe UI" w:cs="Segoe UI"/>
+        </w:rPr>
+        <w:t xml:space="preserve"> the values</w:t>
+      </w:r>
+      <w:r>
+        <w:rPr>
+          <w:rFonts w:ascii="Segoe UI" w:hAnsi="Segoe UI" w:cs="Segoe UI"/>
+        </w:rPr>
+        <w:t xml:space="preserve"> to log.txt</w:t>
       </w:r>
     </w:p>
     <w:p>
@@ -3387,6 +3269,19 @@
     </w:p>
     <w:p>
       <w:pPr>
+        <w:rPr>
+          <w:rFonts w:ascii="Segoe UI" w:hAnsi="Segoe UI" w:cs="Segoe UI"/>
+        </w:rPr>
+      </w:pPr>
+      <w:r>
+        <w:rPr>
+          <w:rFonts w:ascii="Segoe UI" w:hAnsi="Segoe UI" w:cs="Segoe UI"/>
+        </w:rPr>
+        <w:br w:type="page"/>
+      </w:r>
+    </w:p>
+    <w:p>
+      <w:pPr>
         <w:pStyle w:val="Heading2"/>
         <w:rPr>
           <w:rFonts w:ascii="Segoe UI" w:hAnsi="Segoe UI" w:cs="Segoe UI"/>
@@ -3420,54 +3315,40 @@
     </w:p>
     <w:tbl>
       <w:tblPr>
-        <w:tblW w:w="0" w:type="auto"/>
+        <w:tblStyle w:val="TableGrid"/>
+        <w:tblW w:w="6750" w:type="dxa"/>
         <w:jc w:val="center"/>
-        <w:tblCellSpacing w:w="15" w:type="dxa"/>
-        <w:tblBorders>
-          <w:top w:val="single" w:sz="4" w:space="0" w:color="auto"/>
-          <w:left w:val="single" w:sz="4" w:space="0" w:color="auto"/>
-          <w:bottom w:val="single" w:sz="4" w:space="0" w:color="auto"/>
-          <w:right w:val="single" w:sz="4" w:space="0" w:color="auto"/>
-          <w:insideH w:val="single" w:sz="4" w:space="0" w:color="auto"/>
-          <w:insideV w:val="single" w:sz="4" w:space="0" w:color="auto"/>
-        </w:tblBorders>
-        <w:tblCellMar>
-          <w:top w:w="15" w:type="dxa"/>
-          <w:left w:w="15" w:type="dxa"/>
-          <w:bottom w:w="15" w:type="dxa"/>
-          <w:right w:w="15" w:type="dxa"/>
-        </w:tblCellMar>
         <w:tblLook w:val="04A0" w:firstRow="1" w:lastRow="0" w:firstColumn="1" w:lastColumn="0" w:noHBand="0" w:noVBand="1"/>
       </w:tblPr>
       <w:tblGrid>
-        <w:gridCol w:w="1499"/>
-        <w:gridCol w:w="1760"/>
+        <w:gridCol w:w="2520"/>
+        <w:gridCol w:w="4230"/>
       </w:tblGrid>
       <w:tr>
         <w:trPr>
-          <w:tblCellSpacing w:w="15" w:type="dxa"/>
+          <w:trHeight w:val="348"/>
           <w:jc w:val="center"/>
         </w:trPr>
         <w:tc>
           <w:tcPr>
-            <w:tcW w:w="0" w:type="auto"/>
-            <w:vAlign w:val="center"/>
+            <w:tcW w:w="2520" w:type="dxa"/>
             <w:hideMark/>
           </w:tcPr>
           <w:p>
             <w:pPr>
-              <w:spacing w:line="240" w:lineRule="auto"/>
               <w:rPr>
-                <w:rFonts w:ascii="Segoe UI" w:hAnsi="Segoe UI" w:cs="Segoe UI"/>
+                <w:rFonts w:ascii="Segoe UI" w:eastAsia="Times New Roman" w:hAnsi="Segoe UI" w:cs="Segoe UI"/>
                 <w:b/>
                 <w:bCs/>
+                <w:color w:val="000000"/>
               </w:rPr>
             </w:pPr>
             <w:r>
               <w:rPr>
-                <w:rFonts w:ascii="Segoe UI" w:hAnsi="Segoe UI" w:cs="Segoe UI"/>
+                <w:rFonts w:ascii="Segoe UI" w:eastAsia="Times New Roman" w:hAnsi="Segoe UI" w:cs="Segoe UI"/>
                 <w:b/>
                 <w:bCs/>
+                <w:color w:val="000000"/>
               </w:rPr>
               <w:t>Variable</w:t>
             </w:r>
@@ -3475,24 +3356,24 @@
         </w:tc>
         <w:tc>
           <w:tcPr>
-            <w:tcW w:w="0" w:type="auto"/>
-            <w:vAlign w:val="center"/>
+            <w:tcW w:w="4230" w:type="dxa"/>
             <w:hideMark/>
           </w:tcPr>
           <w:p>
             <w:pPr>
-              <w:spacing w:line="240" w:lineRule="auto"/>
               <w:rPr>
-                <w:rFonts w:ascii="Segoe UI" w:hAnsi="Segoe UI" w:cs="Segoe UI"/>
+                <w:rFonts w:ascii="Segoe UI" w:eastAsia="Times New Roman" w:hAnsi="Segoe UI" w:cs="Segoe UI"/>
                 <w:b/>
                 <w:bCs/>
+                <w:color w:val="000000"/>
               </w:rPr>
             </w:pPr>
             <w:r>
               <w:rPr>
-                <w:rFonts w:ascii="Segoe UI" w:hAnsi="Segoe UI" w:cs="Segoe UI"/>
+                <w:rFonts w:ascii="Segoe UI" w:eastAsia="Times New Roman" w:hAnsi="Segoe UI" w:cs="Segoe UI"/>
                 <w:b/>
                 <w:bCs/>
+                <w:color w:val="000000"/>
               </w:rPr>
               <w:t>Purpose</w:t>
             </w:r>
@@ -3501,26 +3382,26 @@
       </w:tr>
       <w:tr>
         <w:trPr>
-          <w:tblCellSpacing w:w="15" w:type="dxa"/>
+          <w:trHeight w:val="58"/>
           <w:jc w:val="center"/>
         </w:trPr>
         <w:tc>
           <w:tcPr>
-            <w:tcW w:w="0" w:type="auto"/>
-            <w:vAlign w:val="center"/>
+            <w:tcW w:w="2520" w:type="dxa"/>
             <w:hideMark/>
           </w:tcPr>
           <w:p>
             <w:pPr>
-              <w:spacing w:line="240" w:lineRule="auto"/>
               <w:rPr>
-                <w:rFonts w:ascii="Segoe UI" w:hAnsi="Segoe UI" w:cs="Segoe UI"/>
+                <w:rFonts w:ascii="Segoe UI" w:eastAsia="Times New Roman" w:hAnsi="Segoe UI" w:cs="Segoe UI"/>
+                <w:color w:val="000000"/>
               </w:rPr>
             </w:pPr>
             <w:proofErr w:type="spellStart"/>
             <w:r>
               <w:rPr>
-                <w:rFonts w:ascii="Segoe UI" w:hAnsi="Segoe UI" w:cs="Segoe UI"/>
+                <w:rFonts w:ascii="Segoe UI" w:eastAsia="Times New Roman" w:hAnsi="Segoe UI" w:cs="Segoe UI"/>
+                <w:color w:val="000000"/>
               </w:rPr>
               <w:t>g_T</w:t>
             </w:r>
@@ -3529,20 +3410,20 @@
         </w:tc>
         <w:tc>
           <w:tcPr>
-            <w:tcW w:w="0" w:type="auto"/>
-            <w:vAlign w:val="center"/>
+            <w:tcW w:w="4230" w:type="dxa"/>
             <w:hideMark/>
           </w:tcPr>
           <w:p>
             <w:pPr>
-              <w:spacing w:line="240" w:lineRule="auto"/>
               <w:rPr>
-                <w:rFonts w:ascii="Segoe UI" w:hAnsi="Segoe UI" w:cs="Segoe UI"/>
+                <w:rFonts w:ascii="Segoe UI" w:eastAsia="Times New Roman" w:hAnsi="Segoe UI" w:cs="Segoe UI"/>
+                <w:color w:val="000000"/>
               </w:rPr>
             </w:pPr>
             <w:r>
               <w:rPr>
-                <w:rFonts w:ascii="Segoe UI" w:hAnsi="Segoe UI" w:cs="Segoe UI"/>
+                <w:rFonts w:ascii="Segoe UI" w:eastAsia="Times New Roman" w:hAnsi="Segoe UI" w:cs="Segoe UI"/>
+                <w:color w:val="000000"/>
               </w:rPr>
               <w:t>Latest timestamp</w:t>
             </w:r>
@@ -3551,26 +3432,26 @@
       </w:tr>
       <w:tr>
         <w:trPr>
-          <w:tblCellSpacing w:w="15" w:type="dxa"/>
+          <w:trHeight w:val="58"/>
           <w:jc w:val="center"/>
         </w:trPr>
         <w:tc>
           <w:tcPr>
-            <w:tcW w:w="0" w:type="auto"/>
-            <w:vAlign w:val="center"/>
+            <w:tcW w:w="2520" w:type="dxa"/>
             <w:hideMark/>
           </w:tcPr>
           <w:p>
             <w:pPr>
-              <w:spacing w:line="240" w:lineRule="auto"/>
               <w:rPr>
-                <w:rFonts w:ascii="Segoe UI" w:hAnsi="Segoe UI" w:cs="Segoe UI"/>
+                <w:rFonts w:ascii="Segoe UI" w:eastAsia="Times New Roman" w:hAnsi="Segoe UI" w:cs="Segoe UI"/>
+                <w:color w:val="000000"/>
               </w:rPr>
             </w:pPr>
             <w:proofErr w:type="spellStart"/>
             <w:r>
               <w:rPr>
-                <w:rFonts w:ascii="Segoe UI" w:hAnsi="Segoe UI" w:cs="Segoe UI"/>
+                <w:rFonts w:ascii="Segoe UI" w:eastAsia="Times New Roman" w:hAnsi="Segoe UI" w:cs="Segoe UI"/>
+                <w:color w:val="000000"/>
               </w:rPr>
               <w:t>g_period_ns</w:t>
             </w:r>
@@ -3579,20 +3460,20 @@
         </w:tc>
         <w:tc>
           <w:tcPr>
-            <w:tcW w:w="0" w:type="auto"/>
-            <w:vAlign w:val="center"/>
+            <w:tcW w:w="4230" w:type="dxa"/>
             <w:hideMark/>
           </w:tcPr>
           <w:p>
             <w:pPr>
-              <w:spacing w:line="240" w:lineRule="auto"/>
               <w:rPr>
-                <w:rFonts w:ascii="Segoe UI" w:hAnsi="Segoe UI" w:cs="Segoe UI"/>
+                <w:rFonts w:ascii="Segoe UI" w:eastAsia="Times New Roman" w:hAnsi="Segoe UI" w:cs="Segoe UI"/>
+                <w:color w:val="000000"/>
               </w:rPr>
             </w:pPr>
             <w:r>
               <w:rPr>
-                <w:rFonts w:ascii="Segoe UI" w:hAnsi="Segoe UI" w:cs="Segoe UI"/>
+                <w:rFonts w:ascii="Segoe UI" w:eastAsia="Times New Roman" w:hAnsi="Segoe UI" w:cs="Segoe UI"/>
+                <w:color w:val="000000"/>
               </w:rPr>
               <w:t>Sampling period</w:t>
             </w:r>
@@ -3601,26 +3482,26 @@
       </w:tr>
       <w:tr>
         <w:trPr>
-          <w:tblCellSpacing w:w="15" w:type="dxa"/>
+          <w:trHeight w:val="58"/>
           <w:jc w:val="center"/>
         </w:trPr>
         <w:tc>
           <w:tcPr>
-            <w:tcW w:w="0" w:type="auto"/>
-            <w:vAlign w:val="center"/>
+            <w:tcW w:w="2520" w:type="dxa"/>
             <w:hideMark/>
           </w:tcPr>
           <w:p>
             <w:pPr>
-              <w:spacing w:line="240" w:lineRule="auto"/>
               <w:rPr>
-                <w:rFonts w:ascii="Segoe UI" w:hAnsi="Segoe UI" w:cs="Segoe UI"/>
+                <w:rFonts w:ascii="Segoe UI" w:eastAsia="Times New Roman" w:hAnsi="Segoe UI" w:cs="Segoe UI"/>
+                <w:color w:val="000000"/>
               </w:rPr>
             </w:pPr>
             <w:proofErr w:type="spellStart"/>
             <w:r>
               <w:rPr>
-                <w:rFonts w:ascii="Segoe UI" w:hAnsi="Segoe UI" w:cs="Segoe UI"/>
+                <w:rFonts w:ascii="Segoe UI" w:eastAsia="Times New Roman" w:hAnsi="Segoe UI" w:cs="Segoe UI"/>
+                <w:color w:val="000000"/>
               </w:rPr>
               <w:t>g_new_sample</w:t>
             </w:r>
@@ -3629,48 +3510,48 @@
         </w:tc>
         <w:tc>
           <w:tcPr>
-            <w:tcW w:w="0" w:type="auto"/>
-            <w:vAlign w:val="center"/>
+            <w:tcW w:w="4230" w:type="dxa"/>
             <w:hideMark/>
           </w:tcPr>
           <w:p>
             <w:pPr>
-              <w:spacing w:line="240" w:lineRule="auto"/>
               <w:rPr>
-                <w:rFonts w:ascii="Segoe UI" w:hAnsi="Segoe UI" w:cs="Segoe UI"/>
+                <w:rFonts w:ascii="Segoe UI" w:eastAsia="Times New Roman" w:hAnsi="Segoe UI" w:cs="Segoe UI"/>
+                <w:color w:val="000000"/>
               </w:rPr>
             </w:pPr>
             <w:r>
               <w:rPr>
-                <w:rFonts w:ascii="Segoe UI" w:hAnsi="Segoe UI" w:cs="Segoe UI"/>
+                <w:rFonts w:ascii="Segoe UI" w:eastAsia="Times New Roman" w:hAnsi="Segoe UI" w:cs="Segoe UI"/>
+                <w:color w:val="000000"/>
               </w:rPr>
-              <w:t>Event flag</w:t>
+              <w:t>Inform that there is a new sample</w:t>
             </w:r>
           </w:p>
         </w:tc>
       </w:tr>
       <w:tr>
         <w:trPr>
-          <w:tblCellSpacing w:w="15" w:type="dxa"/>
+          <w:trHeight w:val="58"/>
           <w:jc w:val="center"/>
         </w:trPr>
         <w:tc>
           <w:tcPr>
-            <w:tcW w:w="0" w:type="auto"/>
-            <w:vAlign w:val="center"/>
+            <w:tcW w:w="2520" w:type="dxa"/>
             <w:hideMark/>
           </w:tcPr>
           <w:p>
             <w:pPr>
-              <w:spacing w:line="240" w:lineRule="auto"/>
               <w:rPr>
-                <w:rFonts w:ascii="Segoe UI" w:hAnsi="Segoe UI" w:cs="Segoe UI"/>
+                <w:rFonts w:ascii="Segoe UI" w:eastAsia="Times New Roman" w:hAnsi="Segoe UI" w:cs="Segoe UI"/>
+                <w:color w:val="000000"/>
               </w:rPr>
             </w:pPr>
             <w:proofErr w:type="spellStart"/>
             <w:r>
               <w:rPr>
-                <w:rFonts w:ascii="Segoe UI" w:hAnsi="Segoe UI" w:cs="Segoe UI"/>
+                <w:rFonts w:ascii="Segoe UI" w:eastAsia="Times New Roman" w:hAnsi="Segoe UI" w:cs="Segoe UI"/>
+                <w:color w:val="000000"/>
               </w:rPr>
               <w:t>g_running</w:t>
             </w:r>
@@ -3679,22 +3560,22 @@
         </w:tc>
         <w:tc>
           <w:tcPr>
-            <w:tcW w:w="0" w:type="auto"/>
-            <w:vAlign w:val="center"/>
+            <w:tcW w:w="4230" w:type="dxa"/>
             <w:hideMark/>
           </w:tcPr>
           <w:p>
             <w:pPr>
-              <w:spacing w:line="240" w:lineRule="auto"/>
               <w:rPr>
-                <w:rFonts w:ascii="Segoe UI" w:hAnsi="Segoe UI" w:cs="Segoe UI"/>
+                <w:rFonts w:ascii="Segoe UI" w:eastAsia="Times New Roman" w:hAnsi="Segoe UI" w:cs="Segoe UI"/>
+                <w:color w:val="000000"/>
               </w:rPr>
             </w:pPr>
             <w:r>
               <w:rPr>
-                <w:rFonts w:ascii="Segoe UI" w:hAnsi="Segoe UI" w:cs="Segoe UI"/>
+                <w:rFonts w:ascii="Segoe UI" w:eastAsia="Times New Roman" w:hAnsi="Segoe UI" w:cs="Segoe UI"/>
+                <w:color w:val="000000"/>
               </w:rPr>
-              <w:t>Stop control</w:t>
+              <w:t>Stop/Running program control flag</w:t>
             </w:r>
           </w:p>
         </w:tc>
@@ -4545,181 +4426,842 @@
         </w:rPr>
         <w:t>Critical Section Design</w:t>
       </w:r>
+      <w:r>
+        <w:rPr>
+          <w:rFonts w:ascii="Segoe UI" w:hAnsi="Segoe UI" w:cs="Segoe UI"/>
+          <w:color w:val="auto"/>
+        </w:rPr>
+        <w:t xml:space="preserve"> – Protection method</w:t>
+      </w:r>
     </w:p>
     <w:p>
       <w:pPr>
-        <w:spacing w:line="240" w:lineRule="auto"/>
-        <w:rPr>
-          <w:rFonts w:ascii="Segoe UI" w:hAnsi="Segoe UI" w:cs="Segoe UI"/>
-        </w:rPr>
-      </w:pPr>
-      <w:proofErr w:type="spellStart"/>
-      <w:r>
-        <w:rPr>
-          <w:rFonts w:ascii="Segoe UI" w:hAnsi="Segoe UI" w:cs="Segoe UI"/>
-        </w:rPr>
-        <w:t>pthread_mutex_</w:t>
-      </w:r>
-      <w:proofErr w:type="gramStart"/>
-      <w:r>
-        <w:rPr>
-          <w:rFonts w:ascii="Segoe UI" w:hAnsi="Segoe UI" w:cs="Segoe UI"/>
-        </w:rPr>
-        <w:t>lock</w:t>
-      </w:r>
-      <w:proofErr w:type="spellEnd"/>
-      <w:r>
-        <w:rPr>
-          <w:rFonts w:ascii="Segoe UI" w:hAnsi="Segoe UI" w:cs="Segoe UI"/>
-        </w:rPr>
-        <w:t>(</w:t>
-      </w:r>
-      <w:proofErr w:type="gramEnd"/>
-      <w:r>
-        <w:rPr>
-          <w:rFonts w:ascii="Segoe UI" w:hAnsi="Segoe UI" w:cs="Segoe UI"/>
-        </w:rPr>
-        <w:t>)</w:t>
+        <w:pStyle w:val="ListParagraph"/>
+        <w:numPr>
+          <w:ilvl w:val="0"/>
+          <w:numId w:val="33"/>
+        </w:numPr>
+        <w:rPr>
+          <w:rFonts w:ascii="Segoe UI" w:hAnsi="Segoe UI" w:cs="Segoe UI"/>
+        </w:rPr>
+      </w:pPr>
+      <w:r>
+        <w:rPr>
+          <w:rFonts w:ascii="Segoe UI" w:hAnsi="Segoe UI" w:cs="Segoe UI"/>
+        </w:rPr>
+        <w:t>Method 1: Protect sample data (SAMPE ↔ LOGGING)</w:t>
       </w:r>
     </w:p>
     <w:p>
       <w:pPr>
-        <w:spacing w:line="240" w:lineRule="auto"/>
-        <w:rPr>
-          <w:rFonts w:ascii="Segoe UI" w:hAnsi="Segoe UI" w:cs="Segoe UI"/>
-        </w:rPr>
-      </w:pPr>
-      <w:r>
-        <w:rPr>
-          <w:rFonts w:ascii="Segoe UI" w:hAnsi="Segoe UI" w:cs="Segoe UI"/>
-        </w:rPr>
-        <w:t xml:space="preserve">    </w:t>
-      </w:r>
+        <w:spacing w:after="0" w:line="240" w:lineRule="auto"/>
+        <w:ind w:left="1440" w:firstLine="720"/>
+        <w:rPr>
+          <w:rFonts w:ascii="Consolas" w:eastAsia="Times New Roman" w:hAnsi="Consolas" w:cs="Times New Roman"/>
+        </w:rPr>
+      </w:pPr>
       <w:proofErr w:type="spellStart"/>
       <w:r>
         <w:rPr>
-          <w:rFonts w:ascii="Segoe UI" w:hAnsi="Segoe UI" w:cs="Segoe UI"/>
-        </w:rPr>
-        <w:t>g_T</w:t>
+          <w:rFonts w:ascii="Consolas" w:eastAsia="Times New Roman" w:hAnsi="Consolas" w:cs="Times New Roman"/>
+        </w:rPr>
+        <w:t>pthread_mutex_lock</w:t>
       </w:r>
       <w:proofErr w:type="spellEnd"/>
       <w:r>
         <w:rPr>
-          <w:rFonts w:ascii="Segoe UI" w:hAnsi="Segoe UI" w:cs="Segoe UI"/>
-        </w:rPr>
-        <w:t xml:space="preserve"> = ...</w:t>
+          <w:rFonts w:ascii="Consolas" w:eastAsia="Times New Roman" w:hAnsi="Consolas" w:cs="Times New Roman"/>
+        </w:rPr>
+        <w:t>(&amp;</w:t>
+      </w:r>
+      <w:proofErr w:type="spellStart"/>
+      <w:r>
+        <w:rPr>
+          <w:rFonts w:ascii="Consolas" w:eastAsia="Times New Roman" w:hAnsi="Consolas" w:cs="Times New Roman"/>
+        </w:rPr>
+        <w:t>T_sample_mutex</w:t>
+      </w:r>
+      <w:proofErr w:type="spellEnd"/>
+      <w:r>
+        <w:rPr>
+          <w:rFonts w:ascii="Consolas" w:eastAsia="Times New Roman" w:hAnsi="Consolas" w:cs="Times New Roman"/>
+        </w:rPr>
+        <w:t>);</w:t>
       </w:r>
     </w:p>
     <w:p>
       <w:pPr>
-        <w:spacing w:line="240" w:lineRule="auto"/>
-        <w:rPr>
-          <w:rFonts w:ascii="Segoe UI" w:hAnsi="Segoe UI" w:cs="Segoe UI"/>
-        </w:rPr>
-      </w:pPr>
-      <w:r>
-        <w:rPr>
-          <w:rFonts w:ascii="Segoe UI" w:hAnsi="Segoe UI" w:cs="Segoe UI"/>
-        </w:rPr>
-        <w:t xml:space="preserve">    </w:t>
+        <w:spacing w:after="0" w:line="240" w:lineRule="auto"/>
+        <w:ind w:left="2160"/>
+        <w:rPr>
+          <w:rFonts w:ascii="Consolas" w:eastAsia="Times New Roman" w:hAnsi="Consolas" w:cs="Times New Roman"/>
+        </w:rPr>
+      </w:pPr>
+      <w:r>
+        <w:rPr>
+          <w:rFonts w:ascii="Consolas" w:eastAsia="Times New Roman" w:hAnsi="Consolas" w:cs="Times New Roman"/>
+        </w:rPr>
+        <w:t xml:space="preserve">    </w:t>
       </w:r>
       <w:proofErr w:type="spellStart"/>
       <w:r>
         <w:rPr>
-          <w:rFonts w:ascii="Segoe UI" w:hAnsi="Segoe UI" w:cs="Segoe UI"/>
-        </w:rPr>
-        <w:t>g_new_sample</w:t>
+          <w:rFonts w:ascii="Consolas" w:eastAsia="Times New Roman" w:hAnsi="Consolas" w:cs="Times New Roman"/>
+        </w:rPr>
+        <w:t>g_T</w:t>
       </w:r>
       <w:proofErr w:type="spellEnd"/>
       <w:r>
         <w:rPr>
-          <w:rFonts w:ascii="Segoe UI" w:hAnsi="Segoe UI" w:cs="Segoe UI"/>
-        </w:rPr>
-        <w:t xml:space="preserve"> = 1</w:t>
+          <w:rFonts w:ascii="Consolas" w:eastAsia="Times New Roman" w:hAnsi="Consolas" w:cs="Times New Roman"/>
+        </w:rPr>
+        <w:t xml:space="preserve"> =</w:t>
+      </w:r>
+      <w:r>
+        <w:rPr>
+          <w:rFonts w:ascii="Consolas" w:eastAsia="Times New Roman" w:hAnsi="Consolas" w:cs="Times New Roman"/>
+        </w:rPr>
+        <w:t xml:space="preserve"> </w:t>
+      </w:r>
+      <w:proofErr w:type="spellStart"/>
+      <w:r>
+        <w:rPr>
+          <w:rFonts w:ascii="Consolas" w:eastAsia="Times New Roman" w:hAnsi="Consolas" w:cs="Times New Roman"/>
+        </w:rPr>
+        <w:t>current_time_ns</w:t>
+      </w:r>
+      <w:proofErr w:type="spellEnd"/>
+      <w:r>
+        <w:rPr>
+          <w:rFonts w:ascii="Consolas" w:eastAsia="Times New Roman" w:hAnsi="Consolas" w:cs="Times New Roman"/>
+        </w:rPr>
+        <w:t>;</w:t>
       </w:r>
     </w:p>
     <w:p>
       <w:pPr>
-        <w:spacing w:line="240" w:lineRule="auto"/>
-        <w:rPr>
-          <w:rFonts w:ascii="Segoe UI" w:hAnsi="Segoe UI" w:cs="Segoe UI"/>
-        </w:rPr>
-      </w:pPr>
+        <w:spacing w:after="0" w:line="240" w:lineRule="auto"/>
+        <w:ind w:left="2160"/>
+        <w:rPr>
+          <w:rFonts w:ascii="Consolas" w:eastAsia="Times New Roman" w:hAnsi="Consolas" w:cs="Times New Roman"/>
+        </w:rPr>
+      </w:pPr>
+      <w:r>
+        <w:rPr>
+          <w:rFonts w:ascii="Consolas" w:eastAsia="Times New Roman" w:hAnsi="Consolas" w:cs="Times New Roman"/>
+        </w:rPr>
+        <w:t xml:space="preserve">    </w:t>
+      </w:r>
       <w:proofErr w:type="spellStart"/>
       <w:r>
         <w:rPr>
-          <w:rFonts w:ascii="Segoe UI" w:hAnsi="Segoe UI" w:cs="Segoe UI"/>
-        </w:rPr>
-        <w:t>pthread_cond_</w:t>
-      </w:r>
-      <w:proofErr w:type="gramStart"/>
-      <w:r>
-        <w:rPr>
-          <w:rFonts w:ascii="Segoe UI" w:hAnsi="Segoe UI" w:cs="Segoe UI"/>
-        </w:rPr>
-        <w:t>signal</w:t>
+          <w:rFonts w:ascii="Consolas" w:eastAsia="Times New Roman" w:hAnsi="Consolas" w:cs="Times New Roman"/>
+        </w:rPr>
+        <w:t>g_new_sample</w:t>
       </w:r>
       <w:proofErr w:type="spellEnd"/>
       <w:r>
         <w:rPr>
-          <w:rFonts w:ascii="Segoe UI" w:hAnsi="Segoe UI" w:cs="Segoe UI"/>
-        </w:rPr>
-        <w:t>(</w:t>
-      </w:r>
-      <w:proofErr w:type="gramEnd"/>
-      <w:r>
-        <w:rPr>
-          <w:rFonts w:ascii="Segoe UI" w:hAnsi="Segoe UI" w:cs="Segoe UI"/>
-        </w:rPr>
-        <w:t>)</w:t>
+          <w:rFonts w:ascii="Consolas" w:eastAsia="Times New Roman" w:hAnsi="Consolas" w:cs="Times New Roman"/>
+        </w:rPr>
+        <w:t xml:space="preserve"> = 1;</w:t>
       </w:r>
     </w:p>
     <w:p>
       <w:pPr>
-        <w:spacing w:line="240" w:lineRule="auto"/>
-        <w:rPr>
-          <w:rFonts w:ascii="Segoe UI" w:hAnsi="Segoe UI" w:cs="Segoe UI"/>
-        </w:rPr>
-      </w:pPr>
+        <w:spacing w:after="0" w:line="240" w:lineRule="auto"/>
+        <w:ind w:left="2160"/>
+        <w:rPr>
+          <w:rFonts w:ascii="Consolas" w:eastAsia="Times New Roman" w:hAnsi="Consolas" w:cs="Times New Roman"/>
+        </w:rPr>
+      </w:pPr>
+      <w:r>
+        <w:rPr>
+          <w:rFonts w:ascii="Consolas" w:eastAsia="Times New Roman" w:hAnsi="Consolas" w:cs="Times New Roman"/>
+        </w:rPr>
+        <w:t xml:space="preserve">    </w:t>
+      </w:r>
       <w:proofErr w:type="spellStart"/>
       <w:r>
         <w:rPr>
-          <w:rFonts w:ascii="Segoe UI" w:hAnsi="Segoe UI" w:cs="Segoe UI"/>
-        </w:rPr>
-        <w:t>pthread_mutex_</w:t>
-      </w:r>
-      <w:proofErr w:type="gramStart"/>
-      <w:r>
-        <w:rPr>
-          <w:rFonts w:ascii="Segoe UI" w:hAnsi="Segoe UI" w:cs="Segoe UI"/>
-        </w:rPr>
-        <w:t>unlock</w:t>
+          <w:rFonts w:ascii="Consolas" w:eastAsia="Times New Roman" w:hAnsi="Consolas" w:cs="Times New Roman"/>
+        </w:rPr>
+        <w:t>pthread_cond_signal</w:t>
       </w:r>
       <w:proofErr w:type="spellEnd"/>
       <w:r>
         <w:rPr>
-          <w:rFonts w:ascii="Segoe UI" w:hAnsi="Segoe UI" w:cs="Segoe UI"/>
-        </w:rPr>
-        <w:t>(</w:t>
-      </w:r>
-      <w:proofErr w:type="gramEnd"/>
-      <w:r>
-        <w:rPr>
-          <w:rFonts w:ascii="Segoe UI" w:hAnsi="Segoe UI" w:cs="Segoe UI"/>
-        </w:rPr>
-        <w:t>)</w:t>
+          <w:rFonts w:ascii="Consolas" w:eastAsia="Times New Roman" w:hAnsi="Consolas" w:cs="Times New Roman"/>
+        </w:rPr>
+        <w:t>(&amp;</w:t>
+      </w:r>
+      <w:proofErr w:type="spellStart"/>
+      <w:r>
+        <w:rPr>
+          <w:rFonts w:ascii="Consolas" w:eastAsia="Times New Roman" w:hAnsi="Consolas" w:cs="Times New Roman"/>
+        </w:rPr>
+        <w:t>T_cond</w:t>
+      </w:r>
+      <w:proofErr w:type="spellEnd"/>
+      <w:r>
+        <w:rPr>
+          <w:rFonts w:ascii="Consolas" w:eastAsia="Times New Roman" w:hAnsi="Consolas" w:cs="Times New Roman"/>
+        </w:rPr>
+        <w:t>);</w:t>
       </w:r>
     </w:p>
     <w:p>
       <w:pPr>
+        <w:spacing w:after="0" w:line="240" w:lineRule="auto"/>
+        <w:ind w:left="2160"/>
+        <w:rPr>
+          <w:rFonts w:ascii="Consolas" w:eastAsia="Times New Roman" w:hAnsi="Consolas" w:cs="Times New Roman"/>
+        </w:rPr>
+      </w:pPr>
+      <w:proofErr w:type="spellStart"/>
+      <w:r>
+        <w:rPr>
+          <w:rFonts w:ascii="Consolas" w:eastAsia="Times New Roman" w:hAnsi="Consolas" w:cs="Times New Roman"/>
+        </w:rPr>
+        <w:t>pthread_mutex_unlock</w:t>
+      </w:r>
+      <w:proofErr w:type="spellEnd"/>
+      <w:r>
+        <w:rPr>
+          <w:rFonts w:ascii="Consolas" w:eastAsia="Times New Roman" w:hAnsi="Consolas" w:cs="Times New Roman"/>
+        </w:rPr>
+        <w:t>(&amp;</w:t>
+      </w:r>
+      <w:proofErr w:type="spellStart"/>
+      <w:r>
+        <w:rPr>
+          <w:rFonts w:ascii="Consolas" w:eastAsia="Times New Roman" w:hAnsi="Consolas" w:cs="Times New Roman"/>
+        </w:rPr>
+        <w:t>T_sample_mutex</w:t>
+      </w:r>
+      <w:proofErr w:type="spellEnd"/>
+      <w:r>
+        <w:rPr>
+          <w:rFonts w:ascii="Consolas" w:eastAsia="Times New Roman" w:hAnsi="Consolas" w:cs="Times New Roman"/>
+        </w:rPr>
+        <w:t>);</w:t>
+      </w:r>
+    </w:p>
+    <w:p>
+      <w:pPr>
+        <w:spacing w:after="0" w:line="240" w:lineRule="auto"/>
+        <w:ind w:left="2160"/>
+        <w:rPr>
+          <w:rFonts w:ascii="Consolas" w:eastAsia="Times New Roman" w:hAnsi="Consolas" w:cs="Times New Roman"/>
+          <w:sz w:val="24"/>
+          <w:szCs w:val="24"/>
+        </w:rPr>
+      </w:pPr>
+    </w:p>
+    <w:p>
+      <w:pPr>
+        <w:pStyle w:val="ListParagraph"/>
+        <w:numPr>
+          <w:ilvl w:val="0"/>
+          <w:numId w:val="32"/>
+        </w:numPr>
+        <w:spacing w:after="0" w:line="240" w:lineRule="auto"/>
+        <w:rPr>
+          <w:rFonts w:ascii="Segoe UI" w:eastAsia="Times New Roman" w:hAnsi="Segoe UI" w:cs="Segoe UI"/>
+        </w:rPr>
+      </w:pPr>
+      <w:r>
+        <w:rPr>
+          <w:rFonts w:ascii="Segoe UI" w:eastAsia="Times New Roman" w:hAnsi="Segoe UI" w:cs="Segoe UI"/>
+        </w:rPr>
+        <w:t>Method 2: Wait and consume sample (LOGGING thread)</w:t>
+      </w:r>
+    </w:p>
+    <w:p>
+      <w:pPr>
+        <w:spacing w:after="0" w:line="240" w:lineRule="auto"/>
+        <w:ind w:left="2160"/>
+        <w:rPr>
+          <w:rFonts w:ascii="Consolas" w:eastAsia="Times New Roman" w:hAnsi="Consolas" w:cs="Times New Roman"/>
+        </w:rPr>
+      </w:pPr>
+      <w:proofErr w:type="spellStart"/>
+      <w:r>
+        <w:rPr>
+          <w:rFonts w:ascii="Consolas" w:eastAsia="Times New Roman" w:hAnsi="Consolas" w:cs="Times New Roman"/>
+        </w:rPr>
+        <w:t>pthread_mutex_lock</w:t>
+      </w:r>
+      <w:proofErr w:type="spellEnd"/>
+      <w:r>
+        <w:rPr>
+          <w:rFonts w:ascii="Consolas" w:eastAsia="Times New Roman" w:hAnsi="Consolas" w:cs="Times New Roman"/>
+        </w:rPr>
+        <w:t>(&amp;</w:t>
+      </w:r>
+      <w:proofErr w:type="spellStart"/>
+      <w:r>
+        <w:rPr>
+          <w:rFonts w:ascii="Consolas" w:eastAsia="Times New Roman" w:hAnsi="Consolas" w:cs="Times New Roman"/>
+        </w:rPr>
+        <w:t>T_sample_mutex</w:t>
+      </w:r>
+      <w:proofErr w:type="spellEnd"/>
+      <w:r>
+        <w:rPr>
+          <w:rFonts w:ascii="Consolas" w:eastAsia="Times New Roman" w:hAnsi="Consolas" w:cs="Times New Roman"/>
+        </w:rPr>
+        <w:t>);</w:t>
+      </w:r>
+    </w:p>
+    <w:p>
+      <w:pPr>
+        <w:spacing w:after="0" w:line="240" w:lineRule="auto"/>
+        <w:ind w:left="2160"/>
+        <w:rPr>
+          <w:rFonts w:ascii="Consolas" w:eastAsia="Times New Roman" w:hAnsi="Consolas" w:cs="Times New Roman"/>
+        </w:rPr>
+      </w:pPr>
+      <w:r>
+        <w:rPr>
+          <w:rFonts w:ascii="Consolas" w:eastAsia="Times New Roman" w:hAnsi="Consolas" w:cs="Times New Roman"/>
+        </w:rPr>
+        <w:t xml:space="preserve">while </w:t>
+      </w:r>
+      <w:proofErr w:type="gramStart"/>
+      <w:r>
+        <w:rPr>
+          <w:rFonts w:ascii="Consolas" w:eastAsia="Times New Roman" w:hAnsi="Consolas" w:cs="Times New Roman"/>
+        </w:rPr>
+        <w:t>(!</w:t>
+      </w:r>
+      <w:proofErr w:type="spellStart"/>
+      <w:r>
+        <w:rPr>
+          <w:rFonts w:ascii="Consolas" w:eastAsia="Times New Roman" w:hAnsi="Consolas" w:cs="Times New Roman"/>
+        </w:rPr>
+        <w:t>g</w:t>
+      </w:r>
+      <w:proofErr w:type="gramEnd"/>
+      <w:r>
+        <w:rPr>
+          <w:rFonts w:ascii="Consolas" w:eastAsia="Times New Roman" w:hAnsi="Consolas" w:cs="Times New Roman"/>
+        </w:rPr>
+        <w:t>_new_sample</w:t>
+      </w:r>
+      <w:proofErr w:type="spellEnd"/>
+      <w:r>
+        <w:rPr>
+          <w:rFonts w:ascii="Consolas" w:eastAsia="Times New Roman" w:hAnsi="Consolas" w:cs="Times New Roman"/>
+        </w:rPr>
+        <w:t>) {</w:t>
+      </w:r>
+    </w:p>
+    <w:p>
+      <w:pPr>
+        <w:spacing w:after="0" w:line="240" w:lineRule="auto"/>
+        <w:ind w:left="2160"/>
+        <w:rPr>
+          <w:rFonts w:ascii="Consolas" w:eastAsia="Times New Roman" w:hAnsi="Consolas" w:cs="Times New Roman"/>
+        </w:rPr>
+      </w:pPr>
+      <w:r>
+        <w:rPr>
+          <w:rFonts w:ascii="Consolas" w:eastAsia="Times New Roman" w:hAnsi="Consolas" w:cs="Times New Roman"/>
+        </w:rPr>
+        <w:t xml:space="preserve">    </w:t>
+      </w:r>
+      <w:proofErr w:type="spellStart"/>
+      <w:r>
+        <w:rPr>
+          <w:rFonts w:ascii="Consolas" w:eastAsia="Times New Roman" w:hAnsi="Consolas" w:cs="Times New Roman"/>
+        </w:rPr>
+        <w:t>pthread_cond_</w:t>
+      </w:r>
+      <w:proofErr w:type="gramStart"/>
+      <w:r>
+        <w:rPr>
+          <w:rFonts w:ascii="Consolas" w:eastAsia="Times New Roman" w:hAnsi="Consolas" w:cs="Times New Roman"/>
+        </w:rPr>
+        <w:t>wait</w:t>
+      </w:r>
+      <w:proofErr w:type="spellEnd"/>
+      <w:r>
+        <w:rPr>
+          <w:rFonts w:ascii="Consolas" w:eastAsia="Times New Roman" w:hAnsi="Consolas" w:cs="Times New Roman"/>
+        </w:rPr>
+        <w:t>(</w:t>
+      </w:r>
+      <w:proofErr w:type="gramEnd"/>
+      <w:r>
+        <w:rPr>
+          <w:rFonts w:ascii="Consolas" w:eastAsia="Times New Roman" w:hAnsi="Consolas" w:cs="Times New Roman"/>
+        </w:rPr>
+        <w:t>&amp;</w:t>
+      </w:r>
+      <w:proofErr w:type="spellStart"/>
+      <w:r>
+        <w:rPr>
+          <w:rFonts w:ascii="Consolas" w:eastAsia="Times New Roman" w:hAnsi="Consolas" w:cs="Times New Roman"/>
+        </w:rPr>
+        <w:t>T_cond</w:t>
+      </w:r>
+      <w:proofErr w:type="spellEnd"/>
+      <w:r>
+        <w:rPr>
+          <w:rFonts w:ascii="Consolas" w:eastAsia="Times New Roman" w:hAnsi="Consolas" w:cs="Times New Roman"/>
+        </w:rPr>
+        <w:t>, &amp;</w:t>
+      </w:r>
+      <w:proofErr w:type="spellStart"/>
+      <w:r>
+        <w:rPr>
+          <w:rFonts w:ascii="Consolas" w:eastAsia="Times New Roman" w:hAnsi="Consolas" w:cs="Times New Roman"/>
+        </w:rPr>
+        <w:t>T_sample_mutex</w:t>
+      </w:r>
+      <w:proofErr w:type="spellEnd"/>
+      <w:r>
+        <w:rPr>
+          <w:rFonts w:ascii="Consolas" w:eastAsia="Times New Roman" w:hAnsi="Consolas" w:cs="Times New Roman"/>
+        </w:rPr>
+        <w:t>);</w:t>
+      </w:r>
+    </w:p>
+    <w:p>
+      <w:pPr>
+        <w:spacing w:after="0" w:line="240" w:lineRule="auto"/>
+        <w:ind w:left="2160"/>
+        <w:rPr>
+          <w:rFonts w:ascii="Consolas" w:eastAsia="Times New Roman" w:hAnsi="Consolas" w:cs="Times New Roman"/>
+        </w:rPr>
+      </w:pPr>
+      <w:r>
+        <w:rPr>
+          <w:rFonts w:ascii="Consolas" w:eastAsia="Times New Roman" w:hAnsi="Consolas" w:cs="Times New Roman"/>
+        </w:rPr>
+        <w:t>}</w:t>
+      </w:r>
+    </w:p>
+    <w:p>
+      <w:pPr>
+        <w:spacing w:after="0" w:line="240" w:lineRule="auto"/>
+        <w:ind w:left="2160"/>
+        <w:rPr>
+          <w:rFonts w:ascii="Consolas" w:eastAsia="Times New Roman" w:hAnsi="Consolas" w:cs="Times New Roman"/>
+        </w:rPr>
+      </w:pPr>
+      <w:r>
+        <w:rPr>
+          <w:rFonts w:ascii="Consolas" w:eastAsia="Times New Roman" w:hAnsi="Consolas" w:cs="Times New Roman"/>
+        </w:rPr>
+        <w:t xml:space="preserve">    </w:t>
+      </w:r>
+      <w:proofErr w:type="spellStart"/>
+      <w:r>
+        <w:rPr>
+          <w:rFonts w:ascii="Consolas" w:eastAsia="Times New Roman" w:hAnsi="Consolas" w:cs="Times New Roman"/>
+        </w:rPr>
+        <w:t>c</w:t>
+      </w:r>
+      <w:r>
+        <w:rPr>
+          <w:rFonts w:ascii="Consolas" w:eastAsia="Times New Roman" w:hAnsi="Consolas" w:cs="Times New Roman"/>
+        </w:rPr>
+        <w:t>urrent_T</w:t>
+      </w:r>
+      <w:proofErr w:type="spellEnd"/>
+      <w:r>
+        <w:rPr>
+          <w:rFonts w:ascii="Consolas" w:eastAsia="Times New Roman" w:hAnsi="Consolas" w:cs="Times New Roman"/>
+        </w:rPr>
+        <w:t xml:space="preserve"> = </w:t>
+      </w:r>
+      <w:proofErr w:type="spellStart"/>
+      <w:r>
+        <w:rPr>
+          <w:rFonts w:ascii="Consolas" w:eastAsia="Times New Roman" w:hAnsi="Consolas" w:cs="Times New Roman"/>
+        </w:rPr>
+        <w:t>g_T</w:t>
+      </w:r>
+      <w:proofErr w:type="spellEnd"/>
+      <w:r>
+        <w:rPr>
+          <w:rFonts w:ascii="Consolas" w:eastAsia="Times New Roman" w:hAnsi="Consolas" w:cs="Times New Roman"/>
+        </w:rPr>
+        <w:t>;</w:t>
+      </w:r>
+    </w:p>
+    <w:p>
+      <w:pPr>
+        <w:spacing w:after="0" w:line="240" w:lineRule="auto"/>
+        <w:ind w:left="2160"/>
+        <w:rPr>
+          <w:rFonts w:ascii="Consolas" w:eastAsia="Times New Roman" w:hAnsi="Consolas" w:cs="Times New Roman"/>
+        </w:rPr>
+      </w:pPr>
+      <w:r>
+        <w:rPr>
+          <w:rFonts w:ascii="Consolas" w:eastAsia="Times New Roman" w:hAnsi="Consolas" w:cs="Times New Roman"/>
+        </w:rPr>
+        <w:t xml:space="preserve">    </w:t>
+      </w:r>
+      <w:proofErr w:type="spellStart"/>
+      <w:r>
+        <w:rPr>
+          <w:rFonts w:ascii="Consolas" w:eastAsia="Times New Roman" w:hAnsi="Consolas" w:cs="Times New Roman"/>
+        </w:rPr>
+        <w:t>g_new_sample</w:t>
+      </w:r>
+      <w:proofErr w:type="spellEnd"/>
+      <w:r>
+        <w:rPr>
+          <w:rFonts w:ascii="Consolas" w:eastAsia="Times New Roman" w:hAnsi="Consolas" w:cs="Times New Roman"/>
+        </w:rPr>
+        <w:t xml:space="preserve"> = 0;</w:t>
+      </w:r>
+    </w:p>
+    <w:p>
+      <w:pPr>
+        <w:spacing w:after="0" w:line="240" w:lineRule="auto"/>
+        <w:ind w:left="2160"/>
+        <w:rPr>
+          <w:rFonts w:ascii="Consolas" w:eastAsia="Times New Roman" w:hAnsi="Consolas" w:cs="Times New Roman"/>
+        </w:rPr>
+      </w:pPr>
+      <w:proofErr w:type="spellStart"/>
+      <w:r>
+        <w:rPr>
+          <w:rFonts w:ascii="Consolas" w:eastAsia="Times New Roman" w:hAnsi="Consolas" w:cs="Times New Roman"/>
+        </w:rPr>
+        <w:t>pthread_mutex_unlock</w:t>
+      </w:r>
+      <w:proofErr w:type="spellEnd"/>
+      <w:r>
+        <w:rPr>
+          <w:rFonts w:ascii="Consolas" w:eastAsia="Times New Roman" w:hAnsi="Consolas" w:cs="Times New Roman"/>
+        </w:rPr>
+        <w:t>(&amp;</w:t>
+      </w:r>
+      <w:proofErr w:type="spellStart"/>
+      <w:r>
+        <w:rPr>
+          <w:rFonts w:ascii="Consolas" w:eastAsia="Times New Roman" w:hAnsi="Consolas" w:cs="Times New Roman"/>
+        </w:rPr>
+        <w:t>T_sample_mutex</w:t>
+      </w:r>
+      <w:proofErr w:type="spellEnd"/>
+      <w:r>
+        <w:rPr>
+          <w:rFonts w:ascii="Consolas" w:eastAsia="Times New Roman" w:hAnsi="Consolas" w:cs="Times New Roman"/>
+        </w:rPr>
+        <w:t>);</w:t>
+      </w:r>
+    </w:p>
+    <w:p>
+      <w:pPr>
+        <w:spacing w:after="0" w:line="240" w:lineRule="auto"/>
+        <w:rPr>
+          <w:rFonts w:ascii="Consolas" w:eastAsia="Times New Roman" w:hAnsi="Consolas" w:cs="Times New Roman"/>
+          <w:sz w:val="24"/>
+          <w:szCs w:val="24"/>
+        </w:rPr>
+      </w:pPr>
+    </w:p>
+    <w:p>
+      <w:pPr>
+        <w:pStyle w:val="ListParagraph"/>
+        <w:numPr>
+          <w:ilvl w:val="0"/>
+          <w:numId w:val="32"/>
+        </w:numPr>
+        <w:spacing w:after="0" w:line="240" w:lineRule="auto"/>
+        <w:rPr>
+          <w:rFonts w:ascii="Segoe UI" w:eastAsia="Times New Roman" w:hAnsi="Segoe UI" w:cs="Segoe UI"/>
+        </w:rPr>
+      </w:pPr>
+      <w:r>
+        <w:rPr>
+          <w:rFonts w:ascii="Segoe UI" w:eastAsia="Times New Roman" w:hAnsi="Segoe UI" w:cs="Segoe UI"/>
+        </w:rPr>
+        <w:t>Method 3: Update period (INPUT thread)</w:t>
+      </w:r>
+    </w:p>
+    <w:p>
+      <w:pPr>
+        <w:spacing w:after="0" w:line="240" w:lineRule="auto"/>
+        <w:ind w:left="2160"/>
+        <w:rPr>
+          <w:rFonts w:ascii="Consolas" w:eastAsia="Times New Roman" w:hAnsi="Consolas" w:cs="Times New Roman"/>
+        </w:rPr>
+      </w:pPr>
+      <w:proofErr w:type="spellStart"/>
+      <w:r>
+        <w:rPr>
+          <w:rFonts w:ascii="Consolas" w:eastAsia="Times New Roman" w:hAnsi="Consolas" w:cs="Times New Roman"/>
+        </w:rPr>
+        <w:t>pthread_mutex_lock</w:t>
+      </w:r>
+      <w:proofErr w:type="spellEnd"/>
+      <w:r>
+        <w:rPr>
+          <w:rFonts w:ascii="Consolas" w:eastAsia="Times New Roman" w:hAnsi="Consolas" w:cs="Times New Roman"/>
+        </w:rPr>
+        <w:t>(&amp;</w:t>
+      </w:r>
+      <w:proofErr w:type="spellStart"/>
+      <w:r>
+        <w:rPr>
+          <w:rFonts w:ascii="Consolas" w:eastAsia="Times New Roman" w:hAnsi="Consolas" w:cs="Times New Roman"/>
+        </w:rPr>
+        <w:t>period_mutex</w:t>
+      </w:r>
+      <w:proofErr w:type="spellEnd"/>
+      <w:r>
+        <w:rPr>
+          <w:rFonts w:ascii="Consolas" w:eastAsia="Times New Roman" w:hAnsi="Consolas" w:cs="Times New Roman"/>
+        </w:rPr>
+        <w:t>);</w:t>
+      </w:r>
+    </w:p>
+    <w:p>
+      <w:pPr>
+        <w:spacing w:after="0" w:line="240" w:lineRule="auto"/>
+        <w:ind w:left="2160"/>
+        <w:rPr>
+          <w:rFonts w:ascii="Consolas" w:eastAsia="Times New Roman" w:hAnsi="Consolas" w:cs="Times New Roman"/>
+        </w:rPr>
+      </w:pPr>
+      <w:r>
+        <w:rPr>
+          <w:rFonts w:ascii="Consolas" w:eastAsia="Times New Roman" w:hAnsi="Consolas" w:cs="Times New Roman"/>
+        </w:rPr>
+        <w:t xml:space="preserve">    </w:t>
+      </w:r>
+      <w:proofErr w:type="spellStart"/>
+      <w:r>
+        <w:rPr>
+          <w:rFonts w:ascii="Consolas" w:eastAsia="Times New Roman" w:hAnsi="Consolas" w:cs="Times New Roman"/>
+        </w:rPr>
+        <w:t>g_period_ns</w:t>
+      </w:r>
+      <w:proofErr w:type="spellEnd"/>
+      <w:r>
+        <w:rPr>
+          <w:rFonts w:ascii="Consolas" w:eastAsia="Times New Roman" w:hAnsi="Consolas" w:cs="Times New Roman"/>
+        </w:rPr>
+        <w:t xml:space="preserve"> = </w:t>
+      </w:r>
+      <w:proofErr w:type="spellStart"/>
+      <w:r>
+        <w:rPr>
+          <w:rFonts w:ascii="Consolas" w:eastAsia="Times New Roman" w:hAnsi="Consolas" w:cs="Times New Roman"/>
+        </w:rPr>
+        <w:t>new_period</w:t>
+      </w:r>
+      <w:proofErr w:type="spellEnd"/>
+      <w:r>
+        <w:rPr>
+          <w:rFonts w:ascii="Consolas" w:eastAsia="Times New Roman" w:hAnsi="Consolas" w:cs="Times New Roman"/>
+        </w:rPr>
+        <w:t>;</w:t>
+      </w:r>
+    </w:p>
+    <w:p>
+      <w:pPr>
+        <w:spacing w:after="0" w:line="240" w:lineRule="auto"/>
+        <w:ind w:left="2160"/>
+        <w:rPr>
+          <w:rFonts w:ascii="Consolas" w:eastAsia="Times New Roman" w:hAnsi="Consolas" w:cs="Times New Roman"/>
+        </w:rPr>
+      </w:pPr>
+      <w:proofErr w:type="spellStart"/>
+      <w:r>
+        <w:rPr>
+          <w:rFonts w:ascii="Consolas" w:eastAsia="Times New Roman" w:hAnsi="Consolas" w:cs="Times New Roman"/>
+        </w:rPr>
+        <w:t>pthread_mutex_unlock</w:t>
+      </w:r>
+      <w:proofErr w:type="spellEnd"/>
+      <w:r>
+        <w:rPr>
+          <w:rFonts w:ascii="Consolas" w:eastAsia="Times New Roman" w:hAnsi="Consolas" w:cs="Times New Roman"/>
+        </w:rPr>
+        <w:t>(&amp;</w:t>
+      </w:r>
+      <w:proofErr w:type="spellStart"/>
+      <w:r>
+        <w:rPr>
+          <w:rFonts w:ascii="Consolas" w:eastAsia="Times New Roman" w:hAnsi="Consolas" w:cs="Times New Roman"/>
+        </w:rPr>
+        <w:t>period_mutex</w:t>
+      </w:r>
+      <w:proofErr w:type="spellEnd"/>
+      <w:r>
+        <w:rPr>
+          <w:rFonts w:ascii="Consolas" w:eastAsia="Times New Roman" w:hAnsi="Consolas" w:cs="Times New Roman"/>
+        </w:rPr>
+        <w:t>);</w:t>
+      </w:r>
+    </w:p>
+    <w:p>
+      <w:pPr>
+        <w:spacing w:after="0" w:line="240" w:lineRule="auto"/>
+        <w:ind w:left="2160"/>
+        <w:rPr>
+          <w:rFonts w:ascii="Consolas" w:eastAsia="Times New Roman" w:hAnsi="Consolas" w:cs="Times New Roman"/>
+        </w:rPr>
+      </w:pPr>
+    </w:p>
+    <w:p>
+      <w:pPr>
+        <w:pStyle w:val="ListParagraph"/>
+        <w:numPr>
+          <w:ilvl w:val="0"/>
+          <w:numId w:val="32"/>
+        </w:numPr>
+        <w:spacing w:after="0" w:line="300" w:lineRule="atLeast"/>
+        <w:rPr>
+          <w:rFonts w:ascii="Segoe UI" w:eastAsia="Times New Roman" w:hAnsi="Segoe UI" w:cs="Segoe UI"/>
+          <w:sz w:val="21"/>
+          <w:szCs w:val="21"/>
+        </w:rPr>
+      </w:pPr>
+      <w:r>
+        <w:rPr>
+          <w:rFonts w:ascii="Segoe UI" w:eastAsia="Times New Roman" w:hAnsi="Segoe UI" w:cs="Segoe UI"/>
+          <w:sz w:val="21"/>
+          <w:szCs w:val="21"/>
+        </w:rPr>
+        <w:t>Method 4: Read period (SAMPLE thread)</w:t>
+      </w:r>
+    </w:p>
+    <w:p>
+      <w:pPr>
+        <w:spacing w:after="0" w:line="240" w:lineRule="auto"/>
+        <w:ind w:left="2160"/>
+        <w:rPr>
+          <w:rFonts w:ascii="Consolas" w:eastAsia="Times New Roman" w:hAnsi="Consolas" w:cs="Times New Roman"/>
+        </w:rPr>
+      </w:pPr>
+      <w:proofErr w:type="spellStart"/>
+      <w:r>
+        <w:rPr>
+          <w:rFonts w:ascii="Consolas" w:eastAsia="Times New Roman" w:hAnsi="Consolas" w:cs="Times New Roman"/>
+        </w:rPr>
+        <w:t>pthread_mutex_lock</w:t>
+      </w:r>
+      <w:proofErr w:type="spellEnd"/>
+      <w:r>
+        <w:rPr>
+          <w:rFonts w:ascii="Consolas" w:eastAsia="Times New Roman" w:hAnsi="Consolas" w:cs="Times New Roman"/>
+        </w:rPr>
+        <w:t>(&amp;</w:t>
+      </w:r>
+      <w:proofErr w:type="spellStart"/>
+      <w:r>
+        <w:rPr>
+          <w:rFonts w:ascii="Consolas" w:eastAsia="Times New Roman" w:hAnsi="Consolas" w:cs="Times New Roman"/>
+        </w:rPr>
+        <w:t>period_mutex</w:t>
+      </w:r>
+      <w:proofErr w:type="spellEnd"/>
+      <w:r>
+        <w:rPr>
+          <w:rFonts w:ascii="Consolas" w:eastAsia="Times New Roman" w:hAnsi="Consolas" w:cs="Times New Roman"/>
+        </w:rPr>
+        <w:t>);</w:t>
+      </w:r>
+    </w:p>
+    <w:p>
+      <w:pPr>
+        <w:spacing w:after="0" w:line="240" w:lineRule="auto"/>
+        <w:ind w:left="2160"/>
+        <w:rPr>
+          <w:rFonts w:ascii="Consolas" w:eastAsia="Times New Roman" w:hAnsi="Consolas" w:cs="Times New Roman"/>
+        </w:rPr>
+      </w:pPr>
+      <w:r>
+        <w:rPr>
+          <w:rFonts w:ascii="Consolas" w:eastAsia="Times New Roman" w:hAnsi="Consolas" w:cs="Times New Roman"/>
+        </w:rPr>
+        <w:t xml:space="preserve">    period = </w:t>
+      </w:r>
+      <w:proofErr w:type="spellStart"/>
+      <w:r>
+        <w:rPr>
+          <w:rFonts w:ascii="Consolas" w:eastAsia="Times New Roman" w:hAnsi="Consolas" w:cs="Times New Roman"/>
+        </w:rPr>
+        <w:t>g_period_ns</w:t>
+      </w:r>
+      <w:proofErr w:type="spellEnd"/>
+      <w:r>
+        <w:rPr>
+          <w:rFonts w:ascii="Consolas" w:eastAsia="Times New Roman" w:hAnsi="Consolas" w:cs="Times New Roman"/>
+        </w:rPr>
+        <w:t>;</w:t>
+      </w:r>
+    </w:p>
+    <w:p>
+      <w:pPr>
+        <w:spacing w:after="0" w:line="240" w:lineRule="auto"/>
+        <w:ind w:left="2160"/>
+        <w:rPr>
+          <w:rFonts w:ascii="Consolas" w:eastAsia="Times New Roman" w:hAnsi="Consolas" w:cs="Times New Roman"/>
+        </w:rPr>
+      </w:pPr>
+      <w:proofErr w:type="spellStart"/>
+      <w:r>
+        <w:rPr>
+          <w:rFonts w:ascii="Consolas" w:eastAsia="Times New Roman" w:hAnsi="Consolas" w:cs="Times New Roman"/>
+        </w:rPr>
+        <w:t>pthread_mutex_unlock</w:t>
+      </w:r>
+      <w:proofErr w:type="spellEnd"/>
+      <w:r>
+        <w:rPr>
+          <w:rFonts w:ascii="Consolas" w:eastAsia="Times New Roman" w:hAnsi="Consolas" w:cs="Times New Roman"/>
+        </w:rPr>
+        <w:t>(&amp;</w:t>
+      </w:r>
+      <w:proofErr w:type="spellStart"/>
+      <w:r>
+        <w:rPr>
+          <w:rFonts w:ascii="Consolas" w:eastAsia="Times New Roman" w:hAnsi="Consolas" w:cs="Times New Roman"/>
+        </w:rPr>
+        <w:t>period_mutex</w:t>
+      </w:r>
+      <w:proofErr w:type="spellEnd"/>
+      <w:r>
+        <w:rPr>
+          <w:rFonts w:ascii="Consolas" w:eastAsia="Times New Roman" w:hAnsi="Consolas" w:cs="Times New Roman"/>
+        </w:rPr>
+        <w:t>);</w:t>
+      </w:r>
+    </w:p>
+    <w:p>
+      <w:pPr>
+        <w:spacing w:after="0" w:line="240" w:lineRule="auto"/>
+        <w:ind w:left="720"/>
+        <w:rPr>
+          <w:rFonts w:ascii="Segoe UI" w:eastAsia="Times New Roman" w:hAnsi="Segoe UI" w:cs="Segoe UI"/>
+        </w:rPr>
+      </w:pPr>
+    </w:p>
+    <w:p>
+      <w:pPr>
         <w:spacing w:line="240" w:lineRule="auto"/>
         <w:rPr>
           <w:rFonts w:ascii="Segoe UI" w:hAnsi="Segoe UI" w:cs="Segoe UI"/>
-        </w:rPr>
-      </w:pPr>
-      <w:r>
-        <w:rPr>
-          <w:rFonts w:ascii="Segoe UI" w:hAnsi="Segoe UI" w:cs="Segoe UI"/>
+          <w:b/>
+          <w:bCs/>
+        </w:rPr>
+      </w:pPr>
+      <w:r>
+        <w:rPr>
+          <w:rFonts w:ascii="Segoe UI" w:hAnsi="Segoe UI" w:cs="Segoe UI"/>
+          <w:b/>
+          <w:bCs/>
         </w:rPr>
         <w:t>Key idea:</w:t>
       </w:r>
@@ -4859,12 +5401,19 @@
       </w:r>
     </w:p>
     <w:p>
+      <w:pPr>
+        <w:rPr>
+          <w:rFonts w:ascii="Segoe UI" w:hAnsi="Segoe UI" w:cs="Segoe UI"/>
+          <w:b/>
+          <w:bCs/>
+        </w:rPr>
+      </w:pPr>
       <w:r>
         <w:drawing>
-          <wp:inline distT="0" distB="0" distL="0" distR="0" wp14:anchorId="157C32E7" wp14:editId="59CAFCAC">
-            <wp:extent cx="6858000" cy="3136900"/>
-            <wp:effectExtent l="0" t="0" r="0" b="6350"/>
-            <wp:docPr id="1973909246" name="Picture 1"/>
+          <wp:inline distT="0" distB="0" distL="0" distR="0" wp14:anchorId="5F30A3A5" wp14:editId="1373C2E5">
+            <wp:extent cx="6858000" cy="2587625"/>
+            <wp:effectExtent l="0" t="0" r="0" b="3175"/>
+            <wp:docPr id="497087100" name="Picture 1"/>
             <wp:cNvGraphicFramePr>
               <a:graphicFrameLocks xmlns:a="http://schemas.openxmlformats.org/drawingml/2006/main" noChangeAspect="1"/>
             </wp:cNvGraphicFramePr>
@@ -4872,7 +5421,7 @@
               <a:graphicData uri="http://schemas.openxmlformats.org/drawingml/2006/picture">
                 <pic:pic xmlns:pic="http://schemas.openxmlformats.org/drawingml/2006/picture">
                   <pic:nvPicPr>
-                    <pic:cNvPr id="1973909246" name=""/>
+                    <pic:cNvPr id="497087100" name=""/>
                     <pic:cNvPicPr/>
                   </pic:nvPicPr>
                   <pic:blipFill>
@@ -4884,7 +5433,7 @@
                   <pic:spPr>
                     <a:xfrm>
                       <a:off x="0" y="0"/>
-                      <a:ext cx="6858000" cy="3136900"/>
+                      <a:ext cx="6858000" cy="2587625"/>
                     </a:xfrm>
                     <a:prstGeom prst="rect">
                       <a:avLst/>
@@ -4897,7 +5446,698 @@
         </w:drawing>
       </w:r>
     </w:p>
-    <w:p/>
+    <w:p>
+      <w:pPr>
+        <w:pStyle w:val="ListParagraph"/>
+        <w:numPr>
+          <w:ilvl w:val="0"/>
+          <w:numId w:val="31"/>
+        </w:numPr>
+      </w:pPr>
+      <w:r>
+        <w:rPr>
+          <w:rFonts w:ascii="Segoe UI" w:hAnsi="Segoe UI" w:cs="Segoe UI"/>
+          <w:b/>
+          <w:bCs/>
+        </w:rPr>
+        <w:t xml:space="preserve">Period = 1 </w:t>
+      </w:r>
+      <w:proofErr w:type="spellStart"/>
+      <w:r>
+        <w:rPr>
+          <w:rFonts w:ascii="Segoe UI" w:hAnsi="Segoe UI" w:cs="Segoe UI"/>
+          <w:b/>
+          <w:bCs/>
+        </w:rPr>
+        <w:t>ms</w:t>
+      </w:r>
+      <w:proofErr w:type="spellEnd"/>
+    </w:p>
+    <w:p>
+      <w:pPr>
+        <w:pStyle w:val="ListParagraph"/>
+        <w:numPr>
+          <w:ilvl w:val="1"/>
+          <w:numId w:val="31"/>
+        </w:numPr>
+      </w:pPr>
+      <w:r>
+        <w:rPr>
+          <w:rFonts w:ascii="Segoe UI" w:hAnsi="Segoe UI" w:cs="Segoe UI"/>
+        </w:rPr>
+        <w:t xml:space="preserve">Interval ~1.0 </w:t>
+      </w:r>
+      <w:proofErr w:type="spellStart"/>
+      <w:r>
+        <w:rPr>
+          <w:rFonts w:ascii="Segoe UI" w:hAnsi="Segoe UI" w:cs="Segoe UI"/>
+        </w:rPr>
+        <w:t>ms</w:t>
+      </w:r>
+      <w:proofErr w:type="spellEnd"/>
+      <w:r>
+        <w:rPr>
+          <w:rFonts w:ascii="Segoe UI" w:hAnsi="Segoe UI" w:cs="Segoe UI"/>
+        </w:rPr>
+        <w:t>, very stable</w:t>
+      </w:r>
+      <w:r>
+        <w:rPr>
+          <w:rFonts w:ascii="Segoe UI" w:hAnsi="Segoe UI" w:cs="Segoe UI"/>
+        </w:rPr>
+        <w:t>.</w:t>
+      </w:r>
+    </w:p>
+    <w:p>
+      <w:pPr>
+        <w:pStyle w:val="ListParagraph"/>
+        <w:numPr>
+          <w:ilvl w:val="1"/>
+          <w:numId w:val="31"/>
+        </w:numPr>
+      </w:pPr>
+      <w:r>
+        <w:rPr>
+          <w:rFonts w:ascii="Segoe UI" w:hAnsi="Segoe UI" w:cs="Segoe UI"/>
+        </w:rPr>
+        <w:t>Jitter: very small (~1–2%)</w:t>
+      </w:r>
+    </w:p>
+    <w:p>
+      <w:pPr>
+        <w:pStyle w:val="ListParagraph"/>
+        <w:numPr>
+          <w:ilvl w:val="1"/>
+          <w:numId w:val="31"/>
+        </w:numPr>
+      </w:pPr>
+      <w:r>
+        <w:rPr>
+          <w:rFonts w:ascii="Segoe UI" w:hAnsi="Segoe UI" w:cs="Segoe UI"/>
+        </w:rPr>
+        <w:t>Conclusion:</w:t>
+      </w:r>
+    </w:p>
+    <w:p>
+      <w:pPr>
+        <w:pStyle w:val="ListParagraph"/>
+        <w:numPr>
+          <w:ilvl w:val="2"/>
+          <w:numId w:val="31"/>
+        </w:numPr>
+      </w:pPr>
+      <w:r>
+        <w:rPr>
+          <w:rFonts w:ascii="Segoe UI" w:hAnsi="Segoe UI" w:cs="Segoe UI"/>
+        </w:rPr>
+        <w:t>Linux scheduler (SCHED_OTHER) is reliable at millisecond level</w:t>
+      </w:r>
+    </w:p>
+    <w:p>
+      <w:pPr>
+        <w:pStyle w:val="ListParagraph"/>
+        <w:numPr>
+          <w:ilvl w:val="2"/>
+          <w:numId w:val="31"/>
+        </w:numPr>
+      </w:pPr>
+      <w:r>
+        <w:rPr>
+          <w:rFonts w:ascii="Segoe UI" w:hAnsi="Segoe UI" w:cs="Segoe UI"/>
+        </w:rPr>
+        <w:t>High-resolution timers are effective at this scale</w:t>
+      </w:r>
+    </w:p>
+    <w:p>
+      <w:pPr>
+        <w:rPr>
+          <w:rFonts w:ascii="Segoe UI" w:hAnsi="Segoe UI" w:cs="Segoe UI"/>
+        </w:rPr>
+      </w:pPr>
+    </w:p>
+    <w:p>
+      <w:pPr>
+        <w:pStyle w:val="ListParagraph"/>
+        <w:numPr>
+          <w:ilvl w:val="0"/>
+          <w:numId w:val="31"/>
+        </w:numPr>
+        <w:rPr>
+          <w:rFonts w:ascii="Segoe UI" w:hAnsi="Segoe UI" w:cs="Segoe UI"/>
+          <w:b/>
+          <w:bCs/>
+        </w:rPr>
+      </w:pPr>
+      <w:r>
+        <w:rPr>
+          <w:rFonts w:ascii="Segoe UI" w:hAnsi="Segoe UI" w:cs="Segoe UI"/>
+          <w:b/>
+          <w:bCs/>
+        </w:rPr>
+        <w:lastRenderedPageBreak/>
+        <w:t>Period = 100 us</w:t>
+      </w:r>
+    </w:p>
+    <w:p>
+      <w:pPr>
+        <w:pStyle w:val="ListParagraph"/>
+        <w:numPr>
+          <w:ilvl w:val="1"/>
+          <w:numId w:val="31"/>
+        </w:numPr>
+        <w:rPr>
+          <w:rFonts w:ascii="Segoe UI" w:hAnsi="Segoe UI" w:cs="Segoe UI"/>
+        </w:rPr>
+      </w:pPr>
+      <w:r>
+        <w:rPr>
+          <w:rFonts w:ascii="Segoe UI" w:hAnsi="Segoe UI" w:cs="Segoe UI"/>
+        </w:rPr>
+        <w:t>Base interval ~120–150 us</w:t>
+      </w:r>
+    </w:p>
+    <w:p>
+      <w:pPr>
+        <w:pStyle w:val="ListParagraph"/>
+        <w:numPr>
+          <w:ilvl w:val="1"/>
+          <w:numId w:val="31"/>
+        </w:numPr>
+        <w:rPr>
+          <w:rFonts w:ascii="Segoe UI" w:hAnsi="Segoe UI" w:cs="Segoe UI"/>
+        </w:rPr>
+      </w:pPr>
+      <w:r>
+        <w:rPr>
+          <w:rFonts w:ascii="Segoe UI" w:hAnsi="Segoe UI" w:cs="Segoe UI"/>
+        </w:rPr>
+        <w:t>Jitter increases significantly (up to ~300–450 us)</w:t>
+      </w:r>
+    </w:p>
+    <w:p>
+      <w:pPr>
+        <w:pStyle w:val="ListParagraph"/>
+        <w:numPr>
+          <w:ilvl w:val="1"/>
+          <w:numId w:val="31"/>
+        </w:numPr>
+        <w:rPr>
+          <w:rFonts w:ascii="Segoe UI" w:hAnsi="Segoe UI" w:cs="Segoe UI"/>
+        </w:rPr>
+      </w:pPr>
+      <w:r>
+        <w:rPr>
+          <w:rFonts w:ascii="Segoe UI" w:hAnsi="Segoe UI" w:cs="Segoe UI"/>
+        </w:rPr>
+        <w:t>Analysis:</w:t>
+      </w:r>
+    </w:p>
+    <w:p>
+      <w:pPr>
+        <w:pStyle w:val="ListParagraph"/>
+        <w:numPr>
+          <w:ilvl w:val="2"/>
+          <w:numId w:val="31"/>
+        </w:numPr>
+        <w:rPr>
+          <w:rFonts w:ascii="Segoe UI" w:hAnsi="Segoe UI" w:cs="Segoe UI"/>
+        </w:rPr>
+      </w:pPr>
+      <w:r>
+        <w:rPr>
+          <w:rFonts w:ascii="Segoe UI" w:hAnsi="Segoe UI" w:cs="Segoe UI"/>
+        </w:rPr>
+        <w:t>Scheduler latency (~10–100 us</w:t>
+      </w:r>
+      <w:r>
+        <w:rPr>
+          <w:rFonts w:ascii="Segoe UI" w:hAnsi="Segoe UI" w:cs="Segoe UI"/>
+        </w:rPr>
+        <w:t xml:space="preserve"> - </w:t>
+      </w:r>
+      <w:r>
+        <w:rPr>
+          <w:rFonts w:ascii="Segoe UI" w:hAnsi="Segoe UI" w:cs="Segoe UI"/>
+        </w:rPr>
+        <w:t>Scheduling latency = interrupt latency + scheduler decision + context switch</w:t>
+      </w:r>
+      <w:r>
+        <w:rPr>
+          <w:rFonts w:ascii="Segoe UI" w:hAnsi="Segoe UI" w:cs="Segoe UI"/>
+        </w:rPr>
+        <w:t>) begins to dominate</w:t>
+      </w:r>
+      <w:r>
+        <w:rPr>
+          <w:rFonts w:ascii="Segoe UI" w:hAnsi="Segoe UI" w:cs="Segoe UI"/>
+        </w:rPr>
+        <w:t>.</w:t>
+      </w:r>
+    </w:p>
+    <w:p>
+      <w:pPr>
+        <w:pStyle w:val="ListParagraph"/>
+        <w:numPr>
+          <w:ilvl w:val="2"/>
+          <w:numId w:val="31"/>
+        </w:numPr>
+        <w:rPr>
+          <w:rFonts w:ascii="Segoe UI" w:hAnsi="Segoe UI" w:cs="Segoe UI"/>
+        </w:rPr>
+      </w:pPr>
+      <w:r>
+        <w:rPr>
+          <w:rFonts w:ascii="Segoe UI" w:hAnsi="Segoe UI" w:cs="Segoe UI"/>
+        </w:rPr>
+        <w:t>Wake-up is no longer deterministic</w:t>
+      </w:r>
+    </w:p>
+    <w:p>
+      <w:pPr>
+        <w:pStyle w:val="ListParagraph"/>
+        <w:numPr>
+          <w:ilvl w:val="2"/>
+          <w:numId w:val="31"/>
+        </w:numPr>
+        <w:rPr>
+          <w:rFonts w:ascii="Segoe UI" w:hAnsi="Segoe UI" w:cs="Segoe UI"/>
+        </w:rPr>
+      </w:pPr>
+      <w:r>
+        <w:rPr>
+          <w:rFonts w:ascii="Segoe UI" w:hAnsi="Segoe UI" w:cs="Segoe UI"/>
+        </w:rPr>
+        <w:t>Preemption from other interrupts affects timing</w:t>
+      </w:r>
+    </w:p>
+    <w:p>
+      <w:pPr>
+        <w:pStyle w:val="ListParagraph"/>
+        <w:numPr>
+          <w:ilvl w:val="1"/>
+          <w:numId w:val="31"/>
+        </w:numPr>
+        <w:rPr>
+          <w:rFonts w:ascii="Segoe UI" w:hAnsi="Segoe UI" w:cs="Segoe UI"/>
+        </w:rPr>
+      </w:pPr>
+      <w:r>
+        <w:rPr>
+          <w:rFonts w:ascii="Segoe UI" w:hAnsi="Segoe UI" w:cs="Segoe UI"/>
+        </w:rPr>
+        <w:t>Conclusion:</w:t>
+      </w:r>
+    </w:p>
+    <w:p>
+      <w:pPr>
+        <w:pStyle w:val="ListParagraph"/>
+        <w:numPr>
+          <w:ilvl w:val="2"/>
+          <w:numId w:val="31"/>
+        </w:numPr>
+        <w:rPr>
+          <w:rFonts w:ascii="Segoe UI" w:hAnsi="Segoe UI" w:cs="Segoe UI"/>
+        </w:rPr>
+      </w:pPr>
+      <w:r>
+        <w:rPr>
+          <w:rFonts w:ascii="Segoe UI" w:hAnsi="Segoe UI" w:cs="Segoe UI"/>
+        </w:rPr>
+        <w:t>100 us is near the practical limit of Linux user-space timing</w:t>
+      </w:r>
+    </w:p>
+    <w:p>
+      <w:pPr>
+        <w:pStyle w:val="ListParagraph"/>
+        <w:numPr>
+          <w:ilvl w:val="0"/>
+          <w:numId w:val="31"/>
+        </w:numPr>
+        <w:rPr>
+          <w:rFonts w:ascii="Segoe UI" w:hAnsi="Segoe UI" w:cs="Segoe UI"/>
+          <w:b/>
+          <w:bCs/>
+        </w:rPr>
+      </w:pPr>
+      <w:r>
+        <w:rPr>
+          <w:rFonts w:ascii="Segoe UI" w:hAnsi="Segoe UI" w:cs="Segoe UI"/>
+          <w:b/>
+          <w:bCs/>
+        </w:rPr>
+        <w:t>Period = 10 us</w:t>
+      </w:r>
+    </w:p>
+    <w:p>
+      <w:pPr>
+        <w:pStyle w:val="ListParagraph"/>
+        <w:numPr>
+          <w:ilvl w:val="1"/>
+          <w:numId w:val="31"/>
+        </w:numPr>
+        <w:rPr>
+          <w:rFonts w:ascii="Segoe UI" w:hAnsi="Segoe UI" w:cs="Segoe UI"/>
+        </w:rPr>
+      </w:pPr>
+      <w:r>
+        <w:rPr>
+          <w:rFonts w:ascii="Segoe UI" w:hAnsi="Segoe UI" w:cs="Segoe UI"/>
+        </w:rPr>
+        <w:t>Observed interval ~100 us+</w:t>
+      </w:r>
+    </w:p>
+    <w:p>
+      <w:pPr>
+        <w:pStyle w:val="ListParagraph"/>
+        <w:numPr>
+          <w:ilvl w:val="1"/>
+          <w:numId w:val="31"/>
+        </w:numPr>
+        <w:rPr>
+          <w:rFonts w:ascii="Segoe UI" w:hAnsi="Segoe UI" w:cs="Segoe UI"/>
+        </w:rPr>
+      </w:pPr>
+      <w:r>
+        <w:rPr>
+          <w:rFonts w:ascii="Segoe UI" w:hAnsi="Segoe UI" w:cs="Segoe UI"/>
+        </w:rPr>
+        <w:t>No longer follows configured period</w:t>
+      </w:r>
+    </w:p>
+    <w:p>
+      <w:pPr>
+        <w:pStyle w:val="ListParagraph"/>
+        <w:numPr>
+          <w:ilvl w:val="1"/>
+          <w:numId w:val="31"/>
+        </w:numPr>
+        <w:rPr>
+          <w:rFonts w:ascii="Segoe UI" w:hAnsi="Segoe UI" w:cs="Segoe UI"/>
+        </w:rPr>
+      </w:pPr>
+      <w:r>
+        <w:rPr>
+          <w:rFonts w:ascii="Segoe UI" w:hAnsi="Segoe UI" w:cs="Segoe UI"/>
+        </w:rPr>
+        <w:t>Analysis:</w:t>
+      </w:r>
+    </w:p>
+    <w:p>
+      <w:pPr>
+        <w:pStyle w:val="ListParagraph"/>
+        <w:numPr>
+          <w:ilvl w:val="2"/>
+          <w:numId w:val="31"/>
+        </w:numPr>
+        <w:rPr>
+          <w:rFonts w:ascii="Segoe UI" w:hAnsi="Segoe UI" w:cs="Segoe UI"/>
+        </w:rPr>
+      </w:pPr>
+      <w:r>
+        <w:rPr>
+          <w:rFonts w:ascii="Segoe UI" w:hAnsi="Segoe UI" w:cs="Segoe UI"/>
+        </w:rPr>
+        <w:t>Requested period &lt; scheduler latency</w:t>
+      </w:r>
+    </w:p>
+    <w:p>
+      <w:pPr>
+        <w:pStyle w:val="ListParagraph"/>
+        <w:numPr>
+          <w:ilvl w:val="2"/>
+          <w:numId w:val="31"/>
+        </w:numPr>
+        <w:rPr>
+          <w:rFonts w:ascii="Segoe UI" w:hAnsi="Segoe UI" w:cs="Segoe UI"/>
+        </w:rPr>
+      </w:pPr>
+      <w:r>
+        <w:rPr>
+          <w:rFonts w:ascii="Segoe UI" w:hAnsi="Segoe UI" w:cs="Segoe UI"/>
+        </w:rPr>
+        <w:t>Thread cannot wake up fast enough</w:t>
+      </w:r>
+    </w:p>
+    <w:p>
+      <w:pPr>
+        <w:pStyle w:val="ListParagraph"/>
+        <w:numPr>
+          <w:ilvl w:val="1"/>
+          <w:numId w:val="31"/>
+        </w:numPr>
+        <w:rPr>
+          <w:rFonts w:ascii="Segoe UI" w:hAnsi="Segoe UI" w:cs="Segoe UI"/>
+        </w:rPr>
+      </w:pPr>
+      <w:r>
+        <w:rPr>
+          <w:rFonts w:ascii="Segoe UI" w:hAnsi="Segoe UI" w:cs="Segoe UI"/>
+        </w:rPr>
+        <w:t>Conclusion:</w:t>
+      </w:r>
+    </w:p>
+    <w:p>
+      <w:pPr>
+        <w:pStyle w:val="ListParagraph"/>
+        <w:numPr>
+          <w:ilvl w:val="2"/>
+          <w:numId w:val="31"/>
+        </w:numPr>
+        <w:rPr>
+          <w:rFonts w:ascii="Segoe UI" w:hAnsi="Segoe UI" w:cs="Segoe UI"/>
+        </w:rPr>
+      </w:pPr>
+      <w:r>
+        <w:rPr>
+          <w:rFonts w:ascii="Segoe UI" w:hAnsi="Segoe UI" w:cs="Segoe UI"/>
+        </w:rPr>
+        <w:t>Microsecond-level scheduling is not achievable in user-space</w:t>
+      </w:r>
+    </w:p>
+    <w:p>
+      <w:pPr>
+        <w:pStyle w:val="ListParagraph"/>
+        <w:numPr>
+          <w:ilvl w:val="0"/>
+          <w:numId w:val="31"/>
+        </w:numPr>
+        <w:rPr>
+          <w:rFonts w:ascii="Segoe UI" w:hAnsi="Segoe UI" w:cs="Segoe UI"/>
+          <w:b/>
+          <w:bCs/>
+        </w:rPr>
+      </w:pPr>
+      <w:r>
+        <w:rPr>
+          <w:rFonts w:ascii="Segoe UI" w:hAnsi="Segoe UI" w:cs="Segoe UI"/>
+          <w:b/>
+          <w:bCs/>
+        </w:rPr>
+        <w:t>Period = 1 us</w:t>
+      </w:r>
+    </w:p>
+    <w:p>
+      <w:pPr>
+        <w:pStyle w:val="ListParagraph"/>
+        <w:numPr>
+          <w:ilvl w:val="1"/>
+          <w:numId w:val="31"/>
+        </w:numPr>
+        <w:rPr>
+          <w:rFonts w:ascii="Segoe UI" w:hAnsi="Segoe UI" w:cs="Segoe UI"/>
+        </w:rPr>
+      </w:pPr>
+      <w:r>
+        <w:rPr>
+          <w:rFonts w:ascii="Segoe UI" w:hAnsi="Segoe UI" w:cs="Segoe UI"/>
+        </w:rPr>
+        <w:t>Interval stabilizes ~100 us+</w:t>
+      </w:r>
+    </w:p>
+    <w:p>
+      <w:pPr>
+        <w:pStyle w:val="ListParagraph"/>
+        <w:numPr>
+          <w:ilvl w:val="1"/>
+          <w:numId w:val="31"/>
+        </w:numPr>
+        <w:rPr>
+          <w:rFonts w:ascii="Segoe UI" w:hAnsi="Segoe UI" w:cs="Segoe UI"/>
+        </w:rPr>
+      </w:pPr>
+      <w:r>
+        <w:rPr>
+          <w:rFonts w:ascii="Segoe UI" w:hAnsi="Segoe UI" w:cs="Segoe UI"/>
+        </w:rPr>
+        <w:t>Completely decoupled from requested period</w:t>
+      </w:r>
+    </w:p>
+    <w:p>
+      <w:pPr>
+        <w:pStyle w:val="ListParagraph"/>
+        <w:numPr>
+          <w:ilvl w:val="1"/>
+          <w:numId w:val="31"/>
+        </w:numPr>
+        <w:rPr>
+          <w:rFonts w:ascii="Segoe UI" w:hAnsi="Segoe UI" w:cs="Segoe UI"/>
+        </w:rPr>
+      </w:pPr>
+      <w:r>
+        <w:rPr>
+          <w:rFonts w:ascii="Segoe UI" w:hAnsi="Segoe UI" w:cs="Segoe UI"/>
+        </w:rPr>
+        <w:t>Analysis:</w:t>
+      </w:r>
+    </w:p>
+    <w:p>
+      <w:pPr>
+        <w:pStyle w:val="ListParagraph"/>
+        <w:numPr>
+          <w:ilvl w:val="2"/>
+          <w:numId w:val="31"/>
+        </w:numPr>
+        <w:rPr>
+          <w:rFonts w:ascii="Segoe UI" w:hAnsi="Segoe UI" w:cs="Segoe UI"/>
+        </w:rPr>
+      </w:pPr>
+      <w:r>
+        <w:rPr>
+          <w:rFonts w:ascii="Segoe UI" w:hAnsi="Segoe UI" w:cs="Segoe UI"/>
+        </w:rPr>
+        <w:t>System becomes scheduler-bound</w:t>
+      </w:r>
+      <w:r>
+        <w:rPr>
+          <w:rFonts w:ascii="Segoe UI" w:hAnsi="Segoe UI" w:cs="Segoe UI"/>
+        </w:rPr>
+        <w:t xml:space="preserve"> (</w:t>
+      </w:r>
+      <w:r>
+        <w:rPr>
+          <w:rFonts w:ascii="Segoe UI" w:hAnsi="Segoe UI" w:cs="Segoe UI"/>
+        </w:rPr>
+        <w:t>The system is no longer governed by the configured period, but is instead dominated by scheduler latency</w:t>
+      </w:r>
+      <w:r>
+        <w:rPr>
+          <w:rFonts w:ascii="Segoe UI" w:hAnsi="Segoe UI" w:cs="Segoe UI"/>
+        </w:rPr>
+        <w:t>)</w:t>
+      </w:r>
+    </w:p>
+    <w:p>
+      <w:pPr>
+        <w:pStyle w:val="ListParagraph"/>
+        <w:numPr>
+          <w:ilvl w:val="2"/>
+          <w:numId w:val="31"/>
+        </w:numPr>
+        <w:rPr>
+          <w:rFonts w:ascii="Segoe UI" w:hAnsi="Segoe UI" w:cs="Segoe UI"/>
+        </w:rPr>
+      </w:pPr>
+      <w:r>
+        <w:rPr>
+          <w:rFonts w:ascii="Segoe UI" w:hAnsi="Segoe UI" w:cs="Segoe UI"/>
+        </w:rPr>
+        <w:t>Execution governed by CPU availability</w:t>
+      </w:r>
+    </w:p>
+    <w:p>
+      <w:pPr>
+        <w:pStyle w:val="ListParagraph"/>
+        <w:numPr>
+          <w:ilvl w:val="0"/>
+          <w:numId w:val="31"/>
+        </w:numPr>
+        <w:rPr>
+          <w:rFonts w:ascii="Segoe UI" w:hAnsi="Segoe UI" w:cs="Segoe UI"/>
+          <w:b/>
+          <w:bCs/>
+        </w:rPr>
+      </w:pPr>
+      <w:r>
+        <w:rPr>
+          <w:rFonts w:ascii="Segoe UI" w:hAnsi="Segoe UI" w:cs="Segoe UI"/>
+          <w:b/>
+          <w:bCs/>
+        </w:rPr>
+        <w:t>Period = 100 ns</w:t>
+      </w:r>
+    </w:p>
+    <w:p>
+      <w:pPr>
+        <w:pStyle w:val="ListParagraph"/>
+        <w:numPr>
+          <w:ilvl w:val="1"/>
+          <w:numId w:val="31"/>
+        </w:numPr>
+        <w:rPr>
+          <w:rFonts w:ascii="Segoe UI" w:hAnsi="Segoe UI" w:cs="Segoe UI"/>
+        </w:rPr>
+      </w:pPr>
+      <w:r>
+        <w:rPr>
+          <w:rFonts w:ascii="Segoe UI" w:hAnsi="Segoe UI" w:cs="Segoe UI"/>
+        </w:rPr>
+        <w:t>No meaningful timing</w:t>
+      </w:r>
+    </w:p>
+    <w:p>
+      <w:pPr>
+        <w:pStyle w:val="ListParagraph"/>
+        <w:numPr>
+          <w:ilvl w:val="1"/>
+          <w:numId w:val="31"/>
+        </w:numPr>
+        <w:rPr>
+          <w:rFonts w:ascii="Segoe UI" w:hAnsi="Segoe UI" w:cs="Segoe UI"/>
+        </w:rPr>
+      </w:pPr>
+      <w:r>
+        <w:rPr>
+          <w:rFonts w:ascii="Segoe UI" w:hAnsi="Segoe UI" w:cs="Segoe UI"/>
+        </w:rPr>
+        <w:t>Output dominated by noise/scheduling</w:t>
+      </w:r>
+    </w:p>
+    <w:p>
+      <w:pPr>
+        <w:pStyle w:val="ListParagraph"/>
+        <w:numPr>
+          <w:ilvl w:val="1"/>
+          <w:numId w:val="31"/>
+        </w:numPr>
+        <w:rPr>
+          <w:rFonts w:ascii="Segoe UI" w:hAnsi="Segoe UI" w:cs="Segoe UI"/>
+        </w:rPr>
+      </w:pPr>
+      <w:r>
+        <w:rPr>
+          <w:rFonts w:ascii="Segoe UI" w:hAnsi="Segoe UI" w:cs="Segoe UI"/>
+        </w:rPr>
+        <w:t>Conclusion:</w:t>
+      </w:r>
+    </w:p>
+    <w:p>
+      <w:pPr>
+        <w:pStyle w:val="ListParagraph"/>
+        <w:numPr>
+          <w:ilvl w:val="2"/>
+          <w:numId w:val="31"/>
+        </w:numPr>
+        <w:rPr>
+          <w:rFonts w:ascii="Segoe UI" w:hAnsi="Segoe UI" w:cs="Segoe UI"/>
+        </w:rPr>
+      </w:pPr>
+      <w:r>
+        <w:rPr>
+          <w:rFonts w:ascii="Segoe UI" w:hAnsi="Segoe UI" w:cs="Segoe UI"/>
+        </w:rPr>
+        <w:t>Nanosecond-level timing is impossible in user-space</w:t>
+      </w:r>
+    </w:p>
     <w:sectPr>
       <w:pgSz w:w="12240" w:h="15840"/>
       <w:pgMar w:top="720" w:right="720" w:bottom="720" w:left="720" w:header="720" w:footer="720" w:gutter="0"/>
@@ -6964,6 +8204,119 @@
     </w:lvl>
   </w:abstractNum>
   <w:abstractNum w:abstractNumId="23" w15:restartNumberingAfterBreak="0">
+    <w:nsid w:val="56F114A3"/>
+    <w:multiLevelType w:val="hybridMultilevel"/>
+    <w:tmpl w:val="E3D024B6"/>
+    <w:lvl w:ilvl="0" w:tplc="04090005">
+      <w:start w:val="1"/>
+      <w:numFmt w:val="bullet"/>
+      <w:lvlText w:val=""/>
+      <w:lvlJc w:val="left"/>
+      <w:pPr>
+        <w:ind w:left="720" w:hanging="360"/>
+      </w:pPr>
+      <w:rPr>
+        <w:rFonts w:ascii="Wingdings" w:hAnsi="Wingdings" w:hint="default"/>
+      </w:rPr>
+    </w:lvl>
+    <w:lvl w:ilvl="1" w:tplc="04090003" w:tentative="1">
+      <w:start w:val="1"/>
+      <w:numFmt w:val="bullet"/>
+      <w:lvlText w:val="o"/>
+      <w:lvlJc w:val="left"/>
+      <w:pPr>
+        <w:ind w:left="1440" w:hanging="360"/>
+      </w:pPr>
+      <w:rPr>
+        <w:rFonts w:ascii="Courier New" w:hAnsi="Courier New" w:cs="Courier New" w:hint="default"/>
+      </w:rPr>
+    </w:lvl>
+    <w:lvl w:ilvl="2" w:tplc="04090005" w:tentative="1">
+      <w:start w:val="1"/>
+      <w:numFmt w:val="bullet"/>
+      <w:lvlText w:val=""/>
+      <w:lvlJc w:val="left"/>
+      <w:pPr>
+        <w:ind w:left="2160" w:hanging="360"/>
+      </w:pPr>
+      <w:rPr>
+        <w:rFonts w:ascii="Wingdings" w:hAnsi="Wingdings" w:hint="default"/>
+      </w:rPr>
+    </w:lvl>
+    <w:lvl w:ilvl="3" w:tplc="04090001" w:tentative="1">
+      <w:start w:val="1"/>
+      <w:numFmt w:val="bullet"/>
+      <w:lvlText w:val=""/>
+      <w:lvlJc w:val="left"/>
+      <w:pPr>
+        <w:ind w:left="2880" w:hanging="360"/>
+      </w:pPr>
+      <w:rPr>
+        <w:rFonts w:ascii="Symbol" w:hAnsi="Symbol" w:hint="default"/>
+      </w:rPr>
+    </w:lvl>
+    <w:lvl w:ilvl="4" w:tplc="04090003" w:tentative="1">
+      <w:start w:val="1"/>
+      <w:numFmt w:val="bullet"/>
+      <w:lvlText w:val="o"/>
+      <w:lvlJc w:val="left"/>
+      <w:pPr>
+        <w:ind w:left="3600" w:hanging="360"/>
+      </w:pPr>
+      <w:rPr>
+        <w:rFonts w:ascii="Courier New" w:hAnsi="Courier New" w:cs="Courier New" w:hint="default"/>
+      </w:rPr>
+    </w:lvl>
+    <w:lvl w:ilvl="5" w:tplc="04090005" w:tentative="1">
+      <w:start w:val="1"/>
+      <w:numFmt w:val="bullet"/>
+      <w:lvlText w:val=""/>
+      <w:lvlJc w:val="left"/>
+      <w:pPr>
+        <w:ind w:left="4320" w:hanging="360"/>
+      </w:pPr>
+      <w:rPr>
+        <w:rFonts w:ascii="Wingdings" w:hAnsi="Wingdings" w:hint="default"/>
+      </w:rPr>
+    </w:lvl>
+    <w:lvl w:ilvl="6" w:tplc="04090001" w:tentative="1">
+      <w:start w:val="1"/>
+      <w:numFmt w:val="bullet"/>
+      <w:lvlText w:val=""/>
+      <w:lvlJc w:val="left"/>
+      <w:pPr>
+        <w:ind w:left="5040" w:hanging="360"/>
+      </w:pPr>
+      <w:rPr>
+        <w:rFonts w:ascii="Symbol" w:hAnsi="Symbol" w:hint="default"/>
+      </w:rPr>
+    </w:lvl>
+    <w:lvl w:ilvl="7" w:tplc="04090003" w:tentative="1">
+      <w:start w:val="1"/>
+      <w:numFmt w:val="bullet"/>
+      <w:lvlText w:val="o"/>
+      <w:lvlJc w:val="left"/>
+      <w:pPr>
+        <w:ind w:left="5760" w:hanging="360"/>
+      </w:pPr>
+      <w:rPr>
+        <w:rFonts w:ascii="Courier New" w:hAnsi="Courier New" w:cs="Courier New" w:hint="default"/>
+      </w:rPr>
+    </w:lvl>
+    <w:lvl w:ilvl="8" w:tplc="04090005" w:tentative="1">
+      <w:start w:val="1"/>
+      <w:numFmt w:val="bullet"/>
+      <w:lvlText w:val=""/>
+      <w:lvlJc w:val="left"/>
+      <w:pPr>
+        <w:ind w:left="6480" w:hanging="360"/>
+      </w:pPr>
+      <w:rPr>
+        <w:rFonts w:ascii="Wingdings" w:hAnsi="Wingdings" w:hint="default"/>
+      </w:rPr>
+    </w:lvl>
+  </w:abstractNum>
+  <w:abstractNum w:abstractNumId="24" w15:restartNumberingAfterBreak="0">
     <w:nsid w:val="57F64858"/>
     <w:multiLevelType w:val="multilevel"/>
     <w:tmpl w:val="1E366A78"/>
@@ -7112,7 +8465,7 @@
       </w:rPr>
     </w:lvl>
   </w:abstractNum>
-  <w:abstractNum w:abstractNumId="24" w15:restartNumberingAfterBreak="0">
+  <w:abstractNum w:abstractNumId="25" w15:restartNumberingAfterBreak="0">
     <w:nsid w:val="5DFC64D1"/>
     <w:multiLevelType w:val="multilevel"/>
     <w:tmpl w:val="E7CE87F4"/>
@@ -7261,7 +8614,120 @@
       </w:rPr>
     </w:lvl>
   </w:abstractNum>
-  <w:abstractNum w:abstractNumId="25" w15:restartNumberingAfterBreak="0">
+  <w:abstractNum w:abstractNumId="26" w15:restartNumberingAfterBreak="0">
+    <w:nsid w:val="734B4879"/>
+    <w:multiLevelType w:val="hybridMultilevel"/>
+    <w:tmpl w:val="B0368F64"/>
+    <w:lvl w:ilvl="0" w:tplc="04090001">
+      <w:start w:val="1"/>
+      <w:numFmt w:val="bullet"/>
+      <w:lvlText w:val=""/>
+      <w:lvlJc w:val="left"/>
+      <w:pPr>
+        <w:ind w:left="720" w:hanging="360"/>
+      </w:pPr>
+      <w:rPr>
+        <w:rFonts w:ascii="Symbol" w:hAnsi="Symbol" w:hint="default"/>
+      </w:rPr>
+    </w:lvl>
+    <w:lvl w:ilvl="1" w:tplc="04090003">
+      <w:start w:val="1"/>
+      <w:numFmt w:val="bullet"/>
+      <w:lvlText w:val="o"/>
+      <w:lvlJc w:val="left"/>
+      <w:pPr>
+        <w:ind w:left="1440" w:hanging="360"/>
+      </w:pPr>
+      <w:rPr>
+        <w:rFonts w:ascii="Courier New" w:hAnsi="Courier New" w:cs="Courier New" w:hint="default"/>
+      </w:rPr>
+    </w:lvl>
+    <w:lvl w:ilvl="2" w:tplc="04090005">
+      <w:start w:val="1"/>
+      <w:numFmt w:val="bullet"/>
+      <w:lvlText w:val=""/>
+      <w:lvlJc w:val="left"/>
+      <w:pPr>
+        <w:ind w:left="2160" w:hanging="360"/>
+      </w:pPr>
+      <w:rPr>
+        <w:rFonts w:ascii="Wingdings" w:hAnsi="Wingdings" w:hint="default"/>
+      </w:rPr>
+    </w:lvl>
+    <w:lvl w:ilvl="3" w:tplc="04090001" w:tentative="1">
+      <w:start w:val="1"/>
+      <w:numFmt w:val="bullet"/>
+      <w:lvlText w:val=""/>
+      <w:lvlJc w:val="left"/>
+      <w:pPr>
+        <w:ind w:left="2880" w:hanging="360"/>
+      </w:pPr>
+      <w:rPr>
+        <w:rFonts w:ascii="Symbol" w:hAnsi="Symbol" w:hint="default"/>
+      </w:rPr>
+    </w:lvl>
+    <w:lvl w:ilvl="4" w:tplc="04090003" w:tentative="1">
+      <w:start w:val="1"/>
+      <w:numFmt w:val="bullet"/>
+      <w:lvlText w:val="o"/>
+      <w:lvlJc w:val="left"/>
+      <w:pPr>
+        <w:ind w:left="3600" w:hanging="360"/>
+      </w:pPr>
+      <w:rPr>
+        <w:rFonts w:ascii="Courier New" w:hAnsi="Courier New" w:cs="Courier New" w:hint="default"/>
+      </w:rPr>
+    </w:lvl>
+    <w:lvl w:ilvl="5" w:tplc="04090005" w:tentative="1">
+      <w:start w:val="1"/>
+      <w:numFmt w:val="bullet"/>
+      <w:lvlText w:val=""/>
+      <w:lvlJc w:val="left"/>
+      <w:pPr>
+        <w:ind w:left="4320" w:hanging="360"/>
+      </w:pPr>
+      <w:rPr>
+        <w:rFonts w:ascii="Wingdings" w:hAnsi="Wingdings" w:hint="default"/>
+      </w:rPr>
+    </w:lvl>
+    <w:lvl w:ilvl="6" w:tplc="04090001" w:tentative="1">
+      <w:start w:val="1"/>
+      <w:numFmt w:val="bullet"/>
+      <w:lvlText w:val=""/>
+      <w:lvlJc w:val="left"/>
+      <w:pPr>
+        <w:ind w:left="5040" w:hanging="360"/>
+      </w:pPr>
+      <w:rPr>
+        <w:rFonts w:ascii="Symbol" w:hAnsi="Symbol" w:hint="default"/>
+      </w:rPr>
+    </w:lvl>
+    <w:lvl w:ilvl="7" w:tplc="04090003" w:tentative="1">
+      <w:start w:val="1"/>
+      <w:numFmt w:val="bullet"/>
+      <w:lvlText w:val="o"/>
+      <w:lvlJc w:val="left"/>
+      <w:pPr>
+        <w:ind w:left="5760" w:hanging="360"/>
+      </w:pPr>
+      <w:rPr>
+        <w:rFonts w:ascii="Courier New" w:hAnsi="Courier New" w:cs="Courier New" w:hint="default"/>
+      </w:rPr>
+    </w:lvl>
+    <w:lvl w:ilvl="8" w:tplc="04090005" w:tentative="1">
+      <w:start w:val="1"/>
+      <w:numFmt w:val="bullet"/>
+      <w:lvlText w:val=""/>
+      <w:lvlJc w:val="left"/>
+      <w:pPr>
+        <w:ind w:left="6480" w:hanging="360"/>
+      </w:pPr>
+      <w:rPr>
+        <w:rFonts w:ascii="Wingdings" w:hAnsi="Wingdings" w:hint="default"/>
+      </w:rPr>
+    </w:lvl>
+  </w:abstractNum>
+  <w:abstractNum w:abstractNumId="27" w15:restartNumberingAfterBreak="0">
     <w:nsid w:val="7539508E"/>
     <w:multiLevelType w:val="multilevel"/>
     <w:tmpl w:val="62105510"/>
@@ -7410,7 +8876,7 @@
       </w:rPr>
     </w:lvl>
   </w:abstractNum>
-  <w:abstractNum w:abstractNumId="26" w15:restartNumberingAfterBreak="0">
+  <w:abstractNum w:abstractNumId="28" w15:restartNumberingAfterBreak="0">
     <w:nsid w:val="7775263A"/>
     <w:multiLevelType w:val="multilevel"/>
     <w:tmpl w:val="5B5E9854"/>
@@ -7559,7 +9025,7 @@
       </w:rPr>
     </w:lvl>
   </w:abstractNum>
-  <w:abstractNum w:abstractNumId="27" w15:restartNumberingAfterBreak="0">
+  <w:abstractNum w:abstractNumId="29" w15:restartNumberingAfterBreak="0">
     <w:nsid w:val="78D42F1A"/>
     <w:multiLevelType w:val="multilevel"/>
     <w:tmpl w:val="8A685D6C"/>
@@ -7708,7 +9174,7 @@
       </w:rPr>
     </w:lvl>
   </w:abstractNum>
-  <w:abstractNum w:abstractNumId="28" w15:restartNumberingAfterBreak="0">
+  <w:abstractNum w:abstractNumId="30" w15:restartNumberingAfterBreak="0">
     <w:nsid w:val="7AB42195"/>
     <w:multiLevelType w:val="multilevel"/>
     <w:tmpl w:val="04090025"/>
@@ -7801,6 +9267,232 @@
       <w:pPr>
         <w:ind w:left="1584" w:hanging="1584"/>
       </w:pPr>
+    </w:lvl>
+  </w:abstractNum>
+  <w:abstractNum w:abstractNumId="31" w15:restartNumberingAfterBreak="0">
+    <w:nsid w:val="7BBA69DE"/>
+    <w:multiLevelType w:val="hybridMultilevel"/>
+    <w:tmpl w:val="4B9853AA"/>
+    <w:lvl w:ilvl="0" w:tplc="04090001">
+      <w:start w:val="1"/>
+      <w:numFmt w:val="bullet"/>
+      <w:lvlText w:val=""/>
+      <w:lvlJc w:val="left"/>
+      <w:pPr>
+        <w:ind w:left="720" w:hanging="360"/>
+      </w:pPr>
+      <w:rPr>
+        <w:rFonts w:ascii="Symbol" w:hAnsi="Symbol" w:hint="default"/>
+      </w:rPr>
+    </w:lvl>
+    <w:lvl w:ilvl="1" w:tplc="04090003" w:tentative="1">
+      <w:start w:val="1"/>
+      <w:numFmt w:val="bullet"/>
+      <w:lvlText w:val="o"/>
+      <w:lvlJc w:val="left"/>
+      <w:pPr>
+        <w:ind w:left="1440" w:hanging="360"/>
+      </w:pPr>
+      <w:rPr>
+        <w:rFonts w:ascii="Courier New" w:hAnsi="Courier New" w:cs="Courier New" w:hint="default"/>
+      </w:rPr>
+    </w:lvl>
+    <w:lvl w:ilvl="2" w:tplc="04090005" w:tentative="1">
+      <w:start w:val="1"/>
+      <w:numFmt w:val="bullet"/>
+      <w:lvlText w:val=""/>
+      <w:lvlJc w:val="left"/>
+      <w:pPr>
+        <w:ind w:left="2160" w:hanging="360"/>
+      </w:pPr>
+      <w:rPr>
+        <w:rFonts w:ascii="Wingdings" w:hAnsi="Wingdings" w:hint="default"/>
+      </w:rPr>
+    </w:lvl>
+    <w:lvl w:ilvl="3" w:tplc="04090001" w:tentative="1">
+      <w:start w:val="1"/>
+      <w:numFmt w:val="bullet"/>
+      <w:lvlText w:val=""/>
+      <w:lvlJc w:val="left"/>
+      <w:pPr>
+        <w:ind w:left="2880" w:hanging="360"/>
+      </w:pPr>
+      <w:rPr>
+        <w:rFonts w:ascii="Symbol" w:hAnsi="Symbol" w:hint="default"/>
+      </w:rPr>
+    </w:lvl>
+    <w:lvl w:ilvl="4" w:tplc="04090003" w:tentative="1">
+      <w:start w:val="1"/>
+      <w:numFmt w:val="bullet"/>
+      <w:lvlText w:val="o"/>
+      <w:lvlJc w:val="left"/>
+      <w:pPr>
+        <w:ind w:left="3600" w:hanging="360"/>
+      </w:pPr>
+      <w:rPr>
+        <w:rFonts w:ascii="Courier New" w:hAnsi="Courier New" w:cs="Courier New" w:hint="default"/>
+      </w:rPr>
+    </w:lvl>
+    <w:lvl w:ilvl="5" w:tplc="04090005" w:tentative="1">
+      <w:start w:val="1"/>
+      <w:numFmt w:val="bullet"/>
+      <w:lvlText w:val=""/>
+      <w:lvlJc w:val="left"/>
+      <w:pPr>
+        <w:ind w:left="4320" w:hanging="360"/>
+      </w:pPr>
+      <w:rPr>
+        <w:rFonts w:ascii="Wingdings" w:hAnsi="Wingdings" w:hint="default"/>
+      </w:rPr>
+    </w:lvl>
+    <w:lvl w:ilvl="6" w:tplc="04090001" w:tentative="1">
+      <w:start w:val="1"/>
+      <w:numFmt w:val="bullet"/>
+      <w:lvlText w:val=""/>
+      <w:lvlJc w:val="left"/>
+      <w:pPr>
+        <w:ind w:left="5040" w:hanging="360"/>
+      </w:pPr>
+      <w:rPr>
+        <w:rFonts w:ascii="Symbol" w:hAnsi="Symbol" w:hint="default"/>
+      </w:rPr>
+    </w:lvl>
+    <w:lvl w:ilvl="7" w:tplc="04090003" w:tentative="1">
+      <w:start w:val="1"/>
+      <w:numFmt w:val="bullet"/>
+      <w:lvlText w:val="o"/>
+      <w:lvlJc w:val="left"/>
+      <w:pPr>
+        <w:ind w:left="5760" w:hanging="360"/>
+      </w:pPr>
+      <w:rPr>
+        <w:rFonts w:ascii="Courier New" w:hAnsi="Courier New" w:cs="Courier New" w:hint="default"/>
+      </w:rPr>
+    </w:lvl>
+    <w:lvl w:ilvl="8" w:tplc="04090005" w:tentative="1">
+      <w:start w:val="1"/>
+      <w:numFmt w:val="bullet"/>
+      <w:lvlText w:val=""/>
+      <w:lvlJc w:val="left"/>
+      <w:pPr>
+        <w:ind w:left="6480" w:hanging="360"/>
+      </w:pPr>
+      <w:rPr>
+        <w:rFonts w:ascii="Wingdings" w:hAnsi="Wingdings" w:hint="default"/>
+      </w:rPr>
+    </w:lvl>
+  </w:abstractNum>
+  <w:abstractNum w:abstractNumId="32" w15:restartNumberingAfterBreak="0">
+    <w:nsid w:val="7E3E74CE"/>
+    <w:multiLevelType w:val="hybridMultilevel"/>
+    <w:tmpl w:val="92DA31D8"/>
+    <w:lvl w:ilvl="0" w:tplc="04090005">
+      <w:start w:val="1"/>
+      <w:numFmt w:val="bullet"/>
+      <w:lvlText w:val=""/>
+      <w:lvlJc w:val="left"/>
+      <w:pPr>
+        <w:ind w:left="720" w:hanging="360"/>
+      </w:pPr>
+      <w:rPr>
+        <w:rFonts w:ascii="Wingdings" w:hAnsi="Wingdings" w:hint="default"/>
+      </w:rPr>
+    </w:lvl>
+    <w:lvl w:ilvl="1" w:tplc="04090003">
+      <w:start w:val="1"/>
+      <w:numFmt w:val="bullet"/>
+      <w:lvlText w:val="o"/>
+      <w:lvlJc w:val="left"/>
+      <w:pPr>
+        <w:ind w:left="1440" w:hanging="360"/>
+      </w:pPr>
+      <w:rPr>
+        <w:rFonts w:ascii="Courier New" w:hAnsi="Courier New" w:cs="Courier New" w:hint="default"/>
+      </w:rPr>
+    </w:lvl>
+    <w:lvl w:ilvl="2" w:tplc="04090005" w:tentative="1">
+      <w:start w:val="1"/>
+      <w:numFmt w:val="bullet"/>
+      <w:lvlText w:val=""/>
+      <w:lvlJc w:val="left"/>
+      <w:pPr>
+        <w:ind w:left="2160" w:hanging="360"/>
+      </w:pPr>
+      <w:rPr>
+        <w:rFonts w:ascii="Wingdings" w:hAnsi="Wingdings" w:hint="default"/>
+      </w:rPr>
+    </w:lvl>
+    <w:lvl w:ilvl="3" w:tplc="04090001" w:tentative="1">
+      <w:start w:val="1"/>
+      <w:numFmt w:val="bullet"/>
+      <w:lvlText w:val=""/>
+      <w:lvlJc w:val="left"/>
+      <w:pPr>
+        <w:ind w:left="2880" w:hanging="360"/>
+      </w:pPr>
+      <w:rPr>
+        <w:rFonts w:ascii="Symbol" w:hAnsi="Symbol" w:hint="default"/>
+      </w:rPr>
+    </w:lvl>
+    <w:lvl w:ilvl="4" w:tplc="04090003" w:tentative="1">
+      <w:start w:val="1"/>
+      <w:numFmt w:val="bullet"/>
+      <w:lvlText w:val="o"/>
+      <w:lvlJc w:val="left"/>
+      <w:pPr>
+        <w:ind w:left="3600" w:hanging="360"/>
+      </w:pPr>
+      <w:rPr>
+        <w:rFonts w:ascii="Courier New" w:hAnsi="Courier New" w:cs="Courier New" w:hint="default"/>
+      </w:rPr>
+    </w:lvl>
+    <w:lvl w:ilvl="5" w:tplc="04090005" w:tentative="1">
+      <w:start w:val="1"/>
+      <w:numFmt w:val="bullet"/>
+      <w:lvlText w:val=""/>
+      <w:lvlJc w:val="left"/>
+      <w:pPr>
+        <w:ind w:left="4320" w:hanging="360"/>
+      </w:pPr>
+      <w:rPr>
+        <w:rFonts w:ascii="Wingdings" w:hAnsi="Wingdings" w:hint="default"/>
+      </w:rPr>
+    </w:lvl>
+    <w:lvl w:ilvl="6" w:tplc="04090001" w:tentative="1">
+      <w:start w:val="1"/>
+      <w:numFmt w:val="bullet"/>
+      <w:lvlText w:val=""/>
+      <w:lvlJc w:val="left"/>
+      <w:pPr>
+        <w:ind w:left="5040" w:hanging="360"/>
+      </w:pPr>
+      <w:rPr>
+        <w:rFonts w:ascii="Symbol" w:hAnsi="Symbol" w:hint="default"/>
+      </w:rPr>
+    </w:lvl>
+    <w:lvl w:ilvl="7" w:tplc="04090003" w:tentative="1">
+      <w:start w:val="1"/>
+      <w:numFmt w:val="bullet"/>
+      <w:lvlText w:val="o"/>
+      <w:lvlJc w:val="left"/>
+      <w:pPr>
+        <w:ind w:left="5760" w:hanging="360"/>
+      </w:pPr>
+      <w:rPr>
+        <w:rFonts w:ascii="Courier New" w:hAnsi="Courier New" w:cs="Courier New" w:hint="default"/>
+      </w:rPr>
+    </w:lvl>
+    <w:lvl w:ilvl="8" w:tplc="04090005" w:tentative="1">
+      <w:start w:val="1"/>
+      <w:numFmt w:val="bullet"/>
+      <w:lvlText w:val=""/>
+      <w:lvlJc w:val="left"/>
+      <w:pPr>
+        <w:ind w:left="6480" w:hanging="360"/>
+      </w:pPr>
+      <w:rPr>
+        <w:rFonts w:ascii="Wingdings" w:hAnsi="Wingdings" w:hint="default"/>
+      </w:rPr>
     </w:lvl>
   </w:abstractNum>
   <w:num w:numId="1" w16cid:durableId="1611207150">
@@ -7843,7 +9535,7 @@
     <w:abstractNumId w:val="11"/>
   </w:num>
   <w:num w:numId="14" w16cid:durableId="15549358">
-    <w:abstractNumId w:val="24"/>
+    <w:abstractNumId w:val="25"/>
   </w:num>
   <w:num w:numId="15" w16cid:durableId="310596060">
     <w:abstractNumId w:val="13"/>
@@ -7855,16 +9547,16 @@
     <w:abstractNumId w:val="9"/>
   </w:num>
   <w:num w:numId="18" w16cid:durableId="652805124">
-    <w:abstractNumId w:val="26"/>
+    <w:abstractNumId w:val="28"/>
   </w:num>
   <w:num w:numId="19" w16cid:durableId="1521510813">
     <w:abstractNumId w:val="16"/>
   </w:num>
   <w:num w:numId="20" w16cid:durableId="1587691857">
-    <w:abstractNumId w:val="25"/>
+    <w:abstractNumId w:val="27"/>
   </w:num>
   <w:num w:numId="21" w16cid:durableId="1233782088">
-    <w:abstractNumId w:val="27"/>
+    <w:abstractNumId w:val="29"/>
   </w:num>
   <w:num w:numId="22" w16cid:durableId="1894657824">
     <w:abstractNumId w:val="20"/>
@@ -7885,10 +9577,22 @@
     <w:abstractNumId w:val="17"/>
   </w:num>
   <w:num w:numId="28" w16cid:durableId="1812944264">
-    <w:abstractNumId w:val="23"/>
+    <w:abstractNumId w:val="24"/>
   </w:num>
   <w:num w:numId="29" w16cid:durableId="373894303">
-    <w:abstractNumId w:val="28"/>
+    <w:abstractNumId w:val="30"/>
+  </w:num>
+  <w:num w:numId="30" w16cid:durableId="1596480998">
+    <w:abstractNumId w:val="31"/>
+  </w:num>
+  <w:num w:numId="31" w16cid:durableId="1192376433">
+    <w:abstractNumId w:val="26"/>
+  </w:num>
+  <w:num w:numId="32" w16cid:durableId="1224025053">
+    <w:abstractNumId w:val="32"/>
+  </w:num>
+  <w:num w:numId="33" w16cid:durableId="1194687885">
+    <w:abstractNumId w:val="23"/>
   </w:num>
 </w:numbering>
 </file>

</xml_diff>